<commit_message>
Standardize navbar and auth session across all pages
</commit_message>
<xml_diff>
--- a/family-finance-v2.docx
+++ b/family-finance-v2.docx
@@ -4,11 +4,799 @@
   <w:body>
     <w:p>
       <w:r>
+        <w:rPr>
+          <w:cs/>
+        </w:rPr>
+        <w:t xml:space="preserve">บริการ </w:t>
+      </w:r>
+      <w:r>
+        <w:t xml:space="preserve">Free Hosting </w:t>
+      </w:r>
+      <w:r>
+        <w:rPr>
+          <w:cs/>
+        </w:rPr>
+        <w:t>ในปัจจุบันแบ่งออกตามลักษณะการใช้งานและสถาปัตยกรรมของโปรเจกต์อย่างชัดเจน ดังนี้:</w:t>
+      </w:r>
+    </w:p>
+    <w:p>
+      <w:pPr>
+        <w:rPr>
+          <w:b/>
+          <w:bCs/>
+        </w:rPr>
+      </w:pPr>
+      <w:r>
+        <w:rPr>
+          <w:b/>
+          <w:bCs/>
+        </w:rPr>
+        <w:t>1. Static Web Hosting (</w:t>
+      </w:r>
+      <w:r>
+        <w:rPr>
+          <w:b/>
+          <w:bCs/>
+          <w:cs/>
+        </w:rPr>
+        <w:t xml:space="preserve">เหมาะกับ </w:t>
+      </w:r>
+      <w:r>
+        <w:rPr>
+          <w:b/>
+          <w:bCs/>
+        </w:rPr>
+        <w:t>HTML, CSS, JavaScript, React, Vue)</w:t>
+      </w:r>
+    </w:p>
+    <w:p>
+      <w:r>
+        <w:rPr>
+          <w:cs/>
+        </w:rPr>
+        <w:t>เหมาะมากกับโปรเจกต์หน้าบ้าน (</w:t>
+      </w:r>
+      <w:r>
+        <w:t xml:space="preserve">Frontend) </w:t>
+      </w:r>
+      <w:r>
+        <w:rPr>
+          <w:cs/>
+        </w:rPr>
+        <w:t xml:space="preserve">แบบไม่มีฝั่งเซิร์ฟเวอร์ หรือเว็บแบบหน้าเดียวที่เชื่อมต่อไปยัง </w:t>
+      </w:r>
+      <w:r>
+        <w:t xml:space="preserve">API </w:t>
+      </w:r>
+      <w:r>
+        <w:rPr>
+          <w:cs/>
+        </w:rPr>
+        <w:t>ภายนอก:</w:t>
+      </w:r>
+    </w:p>
+    <w:p>
+      <w:pPr>
+        <w:numPr>
+          <w:ilvl w:val="0"/>
+          <w:numId w:val="12"/>
+        </w:numPr>
+      </w:pPr>
+      <w:r>
+        <w:rPr>
+          <w:b/>
+          <w:bCs/>
+        </w:rPr>
+        <w:t>GitHub Pages:</w:t>
+      </w:r>
+      <w:r>
+        <w:t xml:space="preserve"> </w:t>
+      </w:r>
+      <w:r>
+        <w:rPr>
+          <w:cs/>
+        </w:rPr>
+        <w:t xml:space="preserve">ผูกกับ </w:t>
+      </w:r>
+      <w:r>
+        <w:t xml:space="preserve">Git Repository </w:t>
+      </w:r>
+      <w:r>
+        <w:rPr>
+          <w:cs/>
+        </w:rPr>
+        <w:t xml:space="preserve">โดยตรง ฟรี แบนด์วิดท์สูง เหมาะกับเว็บ </w:t>
+      </w:r>
+      <w:r>
+        <w:t xml:space="preserve">Portfolio, </w:t>
+      </w:r>
+      <w:r>
+        <w:rPr>
+          <w:cs/>
+        </w:rPr>
+        <w:t xml:space="preserve">เอกสาร และ </w:t>
+      </w:r>
+      <w:r>
+        <w:t>Static Web</w:t>
+      </w:r>
+    </w:p>
+    <w:p>
+      <w:pPr>
+        <w:numPr>
+          <w:ilvl w:val="0"/>
+          <w:numId w:val="12"/>
+        </w:numPr>
+      </w:pPr>
+      <w:r>
+        <w:rPr>
+          <w:b/>
+          <w:bCs/>
+        </w:rPr>
+        <w:t>Cloudflare Pages:</w:t>
+      </w:r>
+      <w:r>
+        <w:t xml:space="preserve"> </w:t>
+      </w:r>
+      <w:r>
+        <w:rPr>
+          <w:cs/>
+        </w:rPr>
+        <w:t xml:space="preserve">ความเร็วสูงด้วยโครงข่าย </w:t>
+      </w:r>
+      <w:r>
+        <w:t xml:space="preserve">CDN </w:t>
+      </w:r>
+      <w:r>
+        <w:rPr>
+          <w:cs/>
+        </w:rPr>
+        <w:t xml:space="preserve">ทั่วโลก รองรับการผูก </w:t>
+      </w:r>
+      <w:r>
+        <w:t xml:space="preserve">Git </w:t>
+      </w:r>
+      <w:r>
+        <w:rPr>
+          <w:cs/>
+        </w:rPr>
+        <w:t xml:space="preserve">และมี </w:t>
+      </w:r>
+      <w:r>
+        <w:t xml:space="preserve">Build Hours </w:t>
+      </w:r>
+      <w:r>
+        <w:rPr>
+          <w:cs/>
+        </w:rPr>
+        <w:t>ฟรีแบบไม่จำกัดคำขอเข้าชม</w:t>
+      </w:r>
+    </w:p>
+    <w:p>
+      <w:pPr>
+        <w:numPr>
+          <w:ilvl w:val="0"/>
+          <w:numId w:val="12"/>
+        </w:numPr>
+      </w:pPr>
+      <w:r>
+        <w:rPr>
+          <w:b/>
+          <w:bCs/>
+        </w:rPr>
+        <w:t>Vercel:</w:t>
+      </w:r>
+      <w:r>
+        <w:t xml:space="preserve"> </w:t>
+      </w:r>
+      <w:r>
+        <w:rPr>
+          <w:cs/>
+        </w:rPr>
+        <w:t xml:space="preserve">เด่นเรื่อง </w:t>
+      </w:r>
+      <w:r>
+        <w:t xml:space="preserve">Next.js </w:t>
+      </w:r>
+      <w:r>
+        <w:rPr>
+          <w:cs/>
+        </w:rPr>
+        <w:t xml:space="preserve">และ </w:t>
+      </w:r>
+      <w:r>
+        <w:t xml:space="preserve">Frontend Frameworks </w:t>
+      </w:r>
+      <w:r>
+        <w:rPr>
+          <w:cs/>
+        </w:rPr>
+        <w:t xml:space="preserve">ใช้งานง่ายมาก มี </w:t>
+      </w:r>
+      <w:r>
+        <w:t xml:space="preserve">Deploy Previews </w:t>
+      </w:r>
+      <w:r>
+        <w:rPr>
+          <w:cs/>
+        </w:rPr>
+        <w:t>อัตโนมัติ (แพ็กเกจฟรีสำหรับโปรเจกต์ส่วนตัว)</w:t>
+      </w:r>
+    </w:p>
+    <w:p>
+      <w:pPr>
+        <w:numPr>
+          <w:ilvl w:val="0"/>
+          <w:numId w:val="12"/>
+        </w:numPr>
+      </w:pPr>
+      <w:r>
+        <w:rPr>
+          <w:b/>
+          <w:bCs/>
+        </w:rPr>
+        <w:t>Netlify:</w:t>
+      </w:r>
+      <w:r>
+        <w:t xml:space="preserve"> </w:t>
+      </w:r>
+      <w:r>
+        <w:rPr>
+          <w:cs/>
+        </w:rPr>
+        <w:t xml:space="preserve">คล้าย </w:t>
+      </w:r>
+      <w:r>
+        <w:t xml:space="preserve">Vercel </w:t>
+      </w:r>
+      <w:r>
+        <w:rPr>
+          <w:cs/>
+        </w:rPr>
+        <w:t xml:space="preserve">มีฟีเจอร์ </w:t>
+      </w:r>
+      <w:r>
+        <w:t xml:space="preserve">Forms, Serverless Functions </w:t>
+      </w:r>
+      <w:r>
+        <w:rPr>
+          <w:cs/>
+        </w:rPr>
+        <w:t xml:space="preserve">ในตัว ใช้งานง่ายผ่าน </w:t>
+      </w:r>
+      <w:r>
+        <w:t>Git</w:t>
+      </w:r>
+    </w:p>
+    <w:p>
+      <w:pPr>
+        <w:rPr>
+          <w:b/>
+          <w:bCs/>
+        </w:rPr>
+      </w:pPr>
+      <w:r>
+        <w:rPr>
+          <w:b/>
+          <w:bCs/>
+        </w:rPr>
+        <w:t>2. Full-stack &amp; Backend Cloud Hosting (Node.js, Python, Go, Docker)</w:t>
+      </w:r>
+    </w:p>
+    <w:p>
+      <w:r>
+        <w:rPr>
+          <w:cs/>
+        </w:rPr>
+        <w:t xml:space="preserve">เหมาะสำหรับรันโค้ดฝั่ง </w:t>
+      </w:r>
+      <w:r>
+        <w:t xml:space="preserve">Server </w:t>
+      </w:r>
+      <w:r>
+        <w:rPr>
+          <w:cs/>
+        </w:rPr>
+        <w:t xml:space="preserve">หรือ </w:t>
+      </w:r>
+      <w:r>
+        <w:t>REST API:</w:t>
+      </w:r>
+    </w:p>
+    <w:p>
+      <w:pPr>
+        <w:numPr>
+          <w:ilvl w:val="0"/>
+          <w:numId w:val="13"/>
+        </w:numPr>
+      </w:pPr>
+      <w:r>
+        <w:rPr>
+          <w:b/>
+          <w:bCs/>
+        </w:rPr>
+        <w:t>Render:</w:t>
+      </w:r>
+      <w:r>
+        <w:t xml:space="preserve"> </w:t>
+      </w:r>
+      <w:r>
+        <w:rPr>
+          <w:cs/>
+        </w:rPr>
+        <w:t xml:space="preserve">มี </w:t>
+      </w:r>
+      <w:r>
+        <w:t xml:space="preserve">Free Tier </w:t>
+      </w:r>
+      <w:r>
+        <w:rPr>
+          <w:cs/>
+        </w:rPr>
+        <w:t xml:space="preserve">สำหรับ </w:t>
+      </w:r>
+      <w:r>
+        <w:t xml:space="preserve">Web Services (Node.js, Python, Docker) </w:t>
+      </w:r>
+      <w:r>
+        <w:rPr>
+          <w:cs/>
+        </w:rPr>
+        <w:t>ข้อจำกัดคือเมื่อไม่มีการเรียกใช้งาน เซิร์ฟเวอร์จะเข้าสู่โหมดหลับ (</w:t>
+      </w:r>
+      <w:r>
+        <w:t xml:space="preserve">Cold Start) </w:t>
+      </w:r>
+      <w:r>
+        <w:rPr>
+          <w:cs/>
+        </w:rPr>
+        <w:t xml:space="preserve">และใช้เวลาตื่นประมาณ </w:t>
+      </w:r>
+      <w:r>
+        <w:t xml:space="preserve">30-50 </w:t>
+      </w:r>
+      <w:r>
+        <w:rPr>
+          <w:cs/>
+        </w:rPr>
+        <w:t>วินาที</w:t>
+      </w:r>
+    </w:p>
+    <w:p>
+      <w:pPr>
+        <w:numPr>
+          <w:ilvl w:val="0"/>
+          <w:numId w:val="13"/>
+        </w:numPr>
+      </w:pPr>
+      <w:r>
+        <w:rPr>
+          <w:b/>
+          <w:bCs/>
+        </w:rPr>
+        <w:t>Koyeb:</w:t>
+      </w:r>
+      <w:r>
+        <w:t xml:space="preserve"> </w:t>
+      </w:r>
+      <w:r>
+        <w:rPr>
+          <w:cs/>
+        </w:rPr>
+        <w:t xml:space="preserve">รองรับ </w:t>
+      </w:r>
+      <w:r>
+        <w:t xml:space="preserve">Docker deployment </w:t>
+      </w:r>
+      <w:r>
+        <w:rPr>
+          <w:cs/>
+        </w:rPr>
+        <w:t>และรันแอปพลิเคชันได้ มีระดับฟรีที่ประสิทธิภาพดี</w:t>
+      </w:r>
+    </w:p>
+    <w:p>
+      <w:pPr>
+        <w:numPr>
+          <w:ilvl w:val="0"/>
+          <w:numId w:val="13"/>
+        </w:numPr>
+      </w:pPr>
+      <w:r>
+        <w:rPr>
+          <w:b/>
+          <w:bCs/>
+        </w:rPr>
+        <w:t>Fly.io:</w:t>
+      </w:r>
+      <w:r>
+        <w:t xml:space="preserve"> </w:t>
+      </w:r>
+      <w:r>
+        <w:rPr>
+          <w:cs/>
+        </w:rPr>
+        <w:t xml:space="preserve">รัน </w:t>
+      </w:r>
+      <w:r>
+        <w:t xml:space="preserve">Container </w:t>
+      </w:r>
+      <w:r>
+        <w:rPr>
+          <w:cs/>
+        </w:rPr>
+        <w:t>ใกล้ผู้ใช้งาน รองรับแอปขนาดเล็กได้ดี (บางช่วงอาจต้องผูกบัตรเครดิตเพื่อยืนยันตัวตน)</w:t>
+      </w:r>
+    </w:p>
+    <w:p>
+      <w:pPr>
+        <w:rPr>
+          <w:b/>
+          <w:bCs/>
+        </w:rPr>
+      </w:pPr>
+      <w:r>
+        <w:rPr>
+          <w:b/>
+          <w:bCs/>
+        </w:rPr>
+        <w:t>3. Serverless &amp; Edge Functions</w:t>
+      </w:r>
+    </w:p>
+    <w:p>
+      <w:r>
+        <w:rPr>
+          <w:cs/>
+        </w:rPr>
+        <w:t xml:space="preserve">สำหรับงานที่ต้องการประมวลผลเป็น </w:t>
+      </w:r>
+      <w:r>
+        <w:t xml:space="preserve">Request </w:t>
+      </w:r>
+      <w:r>
+        <w:rPr>
+          <w:cs/>
+        </w:rPr>
+        <w:t xml:space="preserve">สั้น ๆ หรือทำ </w:t>
+      </w:r>
+      <w:r>
+        <w:t>Middleware:</w:t>
+      </w:r>
+    </w:p>
+    <w:p>
+      <w:pPr>
+        <w:numPr>
+          <w:ilvl w:val="0"/>
+          <w:numId w:val="14"/>
+        </w:numPr>
+      </w:pPr>
+      <w:r>
+        <w:rPr>
+          <w:b/>
+          <w:bCs/>
+        </w:rPr>
+        <w:t>Cloudflare Workers:</w:t>
+      </w:r>
+      <w:r>
+        <w:t xml:space="preserve"> </w:t>
+      </w:r>
+      <w:r>
+        <w:rPr>
+          <w:cs/>
+        </w:rPr>
+        <w:t xml:space="preserve">ฟรี </w:t>
+      </w:r>
+      <w:r>
+        <w:t>100,000 requests/</w:t>
+      </w:r>
+      <w:r>
+        <w:rPr>
+          <w:cs/>
+        </w:rPr>
+        <w:t xml:space="preserve">วัน ความเร็วสูงมากและไม่มีปัญหา </w:t>
+      </w:r>
+      <w:r>
+        <w:t>Cold Start</w:t>
+      </w:r>
+    </w:p>
+    <w:p>
+      <w:pPr>
+        <w:numPr>
+          <w:ilvl w:val="0"/>
+          <w:numId w:val="14"/>
+        </w:numPr>
+      </w:pPr>
+      <w:r>
+        <w:rPr>
+          <w:b/>
+          <w:bCs/>
+        </w:rPr>
+        <w:t>Vercel / Netlify Functions:</w:t>
+      </w:r>
+      <w:r>
+        <w:t xml:space="preserve"> </w:t>
+      </w:r>
+      <w:r>
+        <w:rPr>
+          <w:cs/>
+        </w:rPr>
+        <w:t xml:space="preserve">รองรับ </w:t>
+      </w:r>
+      <w:r>
+        <w:t xml:space="preserve">Serverless API </w:t>
+      </w:r>
+      <w:r>
+        <w:rPr>
+          <w:cs/>
+        </w:rPr>
+        <w:t>ที่ทำงานร่วมกับโปรเจกต์หน้าบ้านได้ทันที</w:t>
+      </w:r>
+    </w:p>
+    <w:p>
+      <w:pPr>
+        <w:rPr>
+          <w:b/>
+          <w:bCs/>
+        </w:rPr>
+      </w:pPr>
+      <w:r>
+        <w:rPr>
+          <w:b/>
+          <w:bCs/>
+        </w:rPr>
+        <w:lastRenderedPageBreak/>
+        <w:t>4. Database &amp; Backend-as-a-Service (BaaS)</w:t>
+      </w:r>
+    </w:p>
+    <w:p>
+      <w:r>
+        <w:rPr>
+          <w:cs/>
+        </w:rPr>
+        <w:t>หากต้องการฐานข้อมูลหรือระบบจัดการผู้ใช้งานแยกต่างหาก:</w:t>
+      </w:r>
+    </w:p>
+    <w:p>
+      <w:pPr>
+        <w:numPr>
+          <w:ilvl w:val="0"/>
+          <w:numId w:val="15"/>
+        </w:numPr>
+      </w:pPr>
+      <w:r>
+        <w:rPr>
+          <w:b/>
+          <w:bCs/>
+        </w:rPr>
+        <w:t>Supabase:</w:t>
+      </w:r>
+      <w:r>
+        <w:t xml:space="preserve"> </w:t>
+      </w:r>
+      <w:r>
+        <w:rPr>
+          <w:cs/>
+        </w:rPr>
+        <w:t xml:space="preserve">มี </w:t>
+      </w:r>
+      <w:r>
+        <w:t xml:space="preserve">Free Tier </w:t>
+      </w:r>
+      <w:r>
+        <w:rPr>
+          <w:cs/>
+        </w:rPr>
+        <w:t xml:space="preserve">ให้ </w:t>
+      </w:r>
+      <w:r>
+        <w:t xml:space="preserve">Postgres Database </w:t>
+      </w:r>
+      <w:r>
+        <w:rPr>
+          <w:cs/>
+        </w:rPr>
+        <w:t xml:space="preserve">ขนาด </w:t>
+      </w:r>
+      <w:r>
+        <w:t xml:space="preserve">500 MB </w:t>
+      </w:r>
+      <w:r>
+        <w:rPr>
+          <w:cs/>
+        </w:rPr>
+        <w:t xml:space="preserve">พร้อมระบบ </w:t>
+      </w:r>
+      <w:r>
+        <w:t xml:space="preserve">Authentication, REST/GraphQL API </w:t>
+      </w:r>
+      <w:r>
+        <w:rPr>
+          <w:cs/>
+        </w:rPr>
+        <w:t xml:space="preserve">และ </w:t>
+      </w:r>
+      <w:r>
+        <w:t>Realtime</w:t>
+      </w:r>
+    </w:p>
+    <w:p>
+      <w:pPr>
+        <w:numPr>
+          <w:ilvl w:val="0"/>
+          <w:numId w:val="15"/>
+        </w:numPr>
+      </w:pPr>
+      <w:r>
+        <w:rPr>
+          <w:b/>
+          <w:bCs/>
+        </w:rPr>
+        <w:t>Neon.tech:</w:t>
+      </w:r>
+      <w:r>
+        <w:t xml:space="preserve"> Serverless Postgres </w:t>
+      </w:r>
+      <w:r>
+        <w:rPr>
+          <w:cs/>
+        </w:rPr>
+        <w:t xml:space="preserve">มี </w:t>
+      </w:r>
+      <w:r>
+        <w:t xml:space="preserve">Free Tier </w:t>
+      </w:r>
+      <w:r>
+        <w:rPr>
+          <w:cs/>
+        </w:rPr>
+        <w:t xml:space="preserve">เหมาะสำหรับเชื่อมต่อกับแอป </w:t>
+      </w:r>
+      <w:r>
+        <w:t>Backend</w:t>
+      </w:r>
+    </w:p>
+    <w:p>
+      <w:pPr>
+        <w:numPr>
+          <w:ilvl w:val="0"/>
+          <w:numId w:val="15"/>
+        </w:numPr>
+      </w:pPr>
+      <w:r>
+        <w:rPr>
+          <w:b/>
+          <w:bCs/>
+        </w:rPr>
+        <w:t>Firebase:</w:t>
+      </w:r>
+      <w:r>
+        <w:t xml:space="preserve"> </w:t>
+      </w:r>
+      <w:r>
+        <w:rPr>
+          <w:cs/>
+        </w:rPr>
+        <w:t xml:space="preserve">โดดเด่นด้าน </w:t>
+      </w:r>
+      <w:r>
+        <w:t xml:space="preserve">NoSQL (Firestore), </w:t>
+      </w:r>
+      <w:r>
+        <w:rPr>
+          <w:cs/>
+        </w:rPr>
+        <w:t xml:space="preserve">ระบบยืนยันตัวตน และ </w:t>
+      </w:r>
+      <w:r>
+        <w:t>Realtime DB</w:t>
+      </w:r>
+    </w:p>
+    <w:p>
+      <w:pPr>
+        <w:rPr>
+          <w:b/>
+          <w:bCs/>
+        </w:rPr>
+      </w:pPr>
+      <w:r>
+        <w:rPr>
+          <w:b/>
+          <w:bCs/>
+        </w:rPr>
+        <w:t xml:space="preserve">5. Traditional Web Hosting (PHP / MySQL </w:t>
+      </w:r>
+      <w:r>
+        <w:rPr>
+          <w:b/>
+          <w:bCs/>
+          <w:cs/>
+        </w:rPr>
+        <w:t>สไตล์ดั้งเดิม)</w:t>
+      </w:r>
+    </w:p>
+    <w:p>
+      <w:pPr>
+        <w:numPr>
+          <w:ilvl w:val="0"/>
+          <w:numId w:val="16"/>
+        </w:numPr>
+      </w:pPr>
+      <w:r>
+        <w:rPr>
+          <w:b/>
+          <w:bCs/>
+        </w:rPr>
+        <w:t>InfinityFree:</w:t>
+      </w:r>
+      <w:r>
+        <w:t xml:space="preserve"> </w:t>
+      </w:r>
+      <w:r>
+        <w:rPr>
+          <w:cs/>
+        </w:rPr>
+        <w:t xml:space="preserve">ให้พื้นที่และแบนด์วิดท์ไม่จำกัด มี </w:t>
+      </w:r>
+      <w:r>
+        <w:t xml:space="preserve">PHP </w:t>
+      </w:r>
+      <w:r>
+        <w:rPr>
+          <w:cs/>
+        </w:rPr>
+        <w:t xml:space="preserve">และ </w:t>
+      </w:r>
+      <w:r>
+        <w:t xml:space="preserve">MySQL </w:t>
+      </w:r>
+      <w:r>
+        <w:rPr>
+          <w:cs/>
+        </w:rPr>
+        <w:t xml:space="preserve">เหมาะสำหรับเว็บ </w:t>
+      </w:r>
+      <w:r>
+        <w:t xml:space="preserve">PHP </w:t>
+      </w:r>
+      <w:r>
+        <w:rPr>
+          <w:cs/>
+        </w:rPr>
+        <w:t xml:space="preserve">ขนาดเล็ก แต่ประสิทธิภาพและความเสถียรจะสู้กลุ่ม </w:t>
+      </w:r>
+      <w:r>
+        <w:t xml:space="preserve">Cloud/Static </w:t>
+      </w:r>
+      <w:r>
+        <w:rPr>
+          <w:cs/>
+        </w:rPr>
+        <w:t>ด้านบนไม่ได้</w:t>
+      </w:r>
+    </w:p>
+    <w:p>
+      <w:r>
+        <w:rPr>
+          <w:cs/>
+        </w:rPr>
+        <w:t>ต้องการนำไปโฮสต์โปรเจกต์ประเภทไหน หรือใช้ภาษา/เฟรมเวิร์กใดอยู่เป็นหลักครับ</w:t>
+      </w:r>
+      <w:r>
+        <w:t>?</w:t>
+      </w:r>
+    </w:p>
+    <w:p/>
+    <w:p/>
+    <w:p/>
+    <w:p/>
+    <w:p>
+      <w:r>
+        <w:lastRenderedPageBreak/>
         <w:drawing>
-          <wp:inline distT="0" distB="0" distL="0" distR="0" wp14:anchorId="17D9F673" wp14:editId="1FD837FC">
+          <wp:inline distT="0" distB="0" distL="0" distR="0" wp14:anchorId="43923F8C" wp14:editId="5C9CAA36">
             <wp:extent cx="5943600" cy="4683760"/>
             <wp:effectExtent l="0" t="0" r="0" b="2540"/>
-            <wp:docPr id="2036307181" name="Picture 1"/>
+            <wp:docPr id="973971173" name="Picture 1"/>
             <wp:cNvGraphicFramePr>
               <a:graphicFrameLocks xmlns:a="http://schemas.openxmlformats.org/drawingml/2006/main" noChangeAspect="1"/>
             </wp:cNvGraphicFramePr>
@@ -373,21 +1161,7 @@
         <w:rPr>
           <w:cs/>
         </w:rPr>
-        <w:t>จากช่องด้านบนสุดของเว็บ</w:t>
-      </w:r>
-      <w:proofErr w:type="spellStart"/>
-      <w:r>
-        <w:rPr>
-          <w:cs/>
-        </w:rPr>
-        <w:t>เบ</w:t>
-      </w:r>
-      <w:proofErr w:type="spellEnd"/>
-      <w:r>
-        <w:rPr>
-          <w:cs/>
-        </w:rPr>
-        <w:t>ราว์เซอร์ เช่น:</w:t>
+        <w:t>จากช่องด้านบนสุดของเว็บเบราว์เซอร์ เช่น:</w:t>
       </w:r>
     </w:p>
     <w:p>
@@ -592,21 +1366,7 @@
         <w:rPr>
           <w:cs/>
         </w:rPr>
-        <w:t>รอระบบ</w:t>
-      </w:r>
-      <w:proofErr w:type="spellStart"/>
-      <w:r>
-        <w:rPr>
-          <w:cs/>
-        </w:rPr>
-        <w:t>อัปโห</w:t>
-      </w:r>
-      <w:proofErr w:type="spellEnd"/>
-      <w:r>
-        <w:rPr>
-          <w:cs/>
-        </w:rPr>
-        <w:t>ลดสักครู่ เมื่อเสร็จแล้วจะมีปุ่มแจ้งเตือนมุมขวาล่างให้กด</w:t>
+        <w:t>รอระบบอัปโหลดสักครู่ เมื่อเสร็จแล้วจะมีปุ่มแจ้งเตือนมุมขวาล่างให้กด</w:t>
       </w:r>
       <w:r>
         <w:t xml:space="preserve"> </w:t>
@@ -918,7 +1678,6 @@
       <w:r>
         <w:t xml:space="preserve"> </w:t>
       </w:r>
-      <w:proofErr w:type="gramStart"/>
       <w:r>
         <w:rPr>
           <w:cs/>
@@ -926,11 +1685,7 @@
         <w:t>ใส่เครื่องหมายจุด</w:t>
       </w:r>
       <w:r>
-        <w:t xml:space="preserve"> .</w:t>
-      </w:r>
-      <w:proofErr w:type="gramEnd"/>
-      <w:r>
-        <w:t xml:space="preserve"> (</w:t>
+        <w:t xml:space="preserve"> . (</w:t>
       </w:r>
       <w:r>
         <w:rPr>
@@ -1010,15 +1765,7 @@
         <w:t>ตอนนี้ ไฟล์</w:t>
       </w:r>
       <w:r>
-        <w:t xml:space="preserve"> .</w:t>
-      </w:r>
-      <w:proofErr w:type="spellStart"/>
-      <w:r>
-        <w:t>js</w:t>
-      </w:r>
-      <w:proofErr w:type="spellEnd"/>
-      <w:r>
-        <w:t xml:space="preserve"> </w:t>
+        <w:t xml:space="preserve"> .js </w:t>
       </w:r>
       <w:r>
         <w:rPr>
@@ -1027,15 +1774,7 @@
         <w:t>ทั้งหมดขึ้นมาอยู่ชั้นนอกสุดเรียงกัน (ไม่ได้อยู่ในโฟลเดอร์</w:t>
       </w:r>
       <w:r>
-        <w:t xml:space="preserve"> </w:t>
-      </w:r>
-      <w:proofErr w:type="spellStart"/>
-      <w:r>
-        <w:t>js</w:t>
-      </w:r>
-      <w:proofErr w:type="spellEnd"/>
-      <w:r>
-        <w:t xml:space="preserve">/modules/ </w:t>
+        <w:t xml:space="preserve"> js/modules/ </w:t>
       </w:r>
       <w:r>
         <w:rPr>
@@ -1053,15 +1792,7 @@
         <w:t>และยังไม่เห็นโฟลเดอร์</w:t>
       </w:r>
       <w:r>
-        <w:t xml:space="preserve"> </w:t>
-      </w:r>
-      <w:proofErr w:type="spellStart"/>
-      <w:r>
-        <w:t>css</w:t>
-      </w:r>
-      <w:proofErr w:type="spellEnd"/>
-      <w:r>
-        <w:t xml:space="preserve">/ </w:t>
+        <w:t xml:space="preserve"> css/ </w:t>
       </w:r>
     </w:p>
     <w:p>
@@ -1332,21 +2063,7 @@
         <w:rPr>
           <w:cs/>
         </w:rPr>
-        <w:t>แล้ว หน้าจอจะเปลี่ยนไปเป็นหน้าตั้งค่าโปรเจก</w:t>
-      </w:r>
-      <w:proofErr w:type="spellStart"/>
-      <w:r>
-        <w:rPr>
-          <w:cs/>
-        </w:rPr>
-        <w:t>ต์</w:t>
-      </w:r>
-      <w:proofErr w:type="spellEnd"/>
-      <w:r>
-        <w:rPr>
-          <w:cs/>
-        </w:rPr>
-        <w:t xml:space="preserve"> (มีช่องให้ใส่ </w:t>
+        <w:t xml:space="preserve">แล้ว หน้าจอจะเปลี่ยนไปเป็นหน้าตั้งค่าโปรเจกต์ (มีช่องให้ใส่ </w:t>
       </w:r>
       <w:r>
         <w:t xml:space="preserve">Name, Branch, Build Command) </w:t>
@@ -1563,7 +2280,6 @@
       <w:r>
         <w:t xml:space="preserve"> </w:t>
       </w:r>
-      <w:proofErr w:type="gramStart"/>
       <w:r>
         <w:rPr>
           <w:cs/>
@@ -1571,11 +2287,7 @@
         <w:t>ให้พิมพ์เครื่องหมายจุด</w:t>
       </w:r>
       <w:r>
-        <w:t xml:space="preserve"> .</w:t>
-      </w:r>
-      <w:proofErr w:type="gramEnd"/>
-      <w:r>
-        <w:t xml:space="preserve"> </w:t>
+        <w:t xml:space="preserve"> . </w:t>
       </w:r>
       <w:r>
         <w:rPr>
@@ -1683,13 +2395,1054 @@
         <w:t>จะมีลิงก์เว็บแสดงขึ้นมาด้านบน ให้คลิกลิงก์นั้นเพื่อเปิดใช้งานเว็บได้ทันทีครับ</w:t>
       </w:r>
     </w:p>
+    <w:p/>
+    <w:p>
+      <w:pPr>
+        <w:rPr>
+          <w:b/>
+          <w:bCs/>
+        </w:rPr>
+      </w:pPr>
+      <w:r>
+        <w:rPr>
+          <w:b/>
+          <w:bCs/>
+          <w:cs/>
+        </w:rPr>
+        <w:t>วิธีเปิดดูลายแทงลิงก์เว็บไซต์ของคุณ</w:t>
+      </w:r>
+    </w:p>
+    <w:p>
+      <w:pPr>
+        <w:numPr>
+          <w:ilvl w:val="0"/>
+          <w:numId w:val="8"/>
+        </w:numPr>
+      </w:pPr>
+      <w:r>
+        <w:rPr>
+          <w:b/>
+          <w:bCs/>
+          <w:cs/>
+        </w:rPr>
+        <w:t>คลิกที่ชื่อโปรเจกต์ด้านซ้าย:</w:t>
+      </w:r>
+    </w:p>
+    <w:p>
+      <w:pPr>
+        <w:numPr>
+          <w:ilvl w:val="1"/>
+          <w:numId w:val="8"/>
+        </w:numPr>
+      </w:pPr>
+      <w:r>
+        <w:rPr>
+          <w:cs/>
+        </w:rPr>
+        <w:t xml:space="preserve">มองไปที่เมนูด้านซ้ายบนใต้คำว่า </w:t>
+      </w:r>
+      <w:r>
+        <w:t xml:space="preserve">Dashboard </w:t>
+      </w:r>
+      <w:r>
+        <w:rPr>
+          <w:cs/>
+        </w:rPr>
+        <w:t>จะมีชื่อ</w:t>
+      </w:r>
+      <w:r>
+        <w:t xml:space="preserve"> </w:t>
+      </w:r>
+      <w:r>
+        <w:rPr>
+          <w:b/>
+          <w:bCs/>
+        </w:rPr>
+        <w:t>family-finance-v2</w:t>
+      </w:r>
+      <w:r>
+        <w:t xml:space="preserve"> </w:t>
+      </w:r>
+      <w:r>
+        <w:rPr>
+          <w:cs/>
+        </w:rPr>
+        <w:t>อยู่</w:t>
+      </w:r>
+      <w:r>
+        <w:t xml:space="preserve"> </w:t>
+      </w:r>
+    </w:p>
+    <w:p>
+      <w:r>
+        <w:t>PNG</w:t>
+      </w:r>
+    </w:p>
+    <w:p>
+      <w:pPr>
+        <w:numPr>
+          <w:ilvl w:val="1"/>
+          <w:numId w:val="8"/>
+        </w:numPr>
+      </w:pPr>
+      <w:r>
+        <w:rPr>
+          <w:cs/>
+        </w:rPr>
+        <w:t>ให้คลิกที่คำว่า</w:t>
+      </w:r>
+      <w:r>
+        <w:t xml:space="preserve"> </w:t>
+      </w:r>
+      <w:r>
+        <w:rPr>
+          <w:b/>
+          <w:bCs/>
+        </w:rPr>
+        <w:t>family-finance-v2</w:t>
+      </w:r>
+      <w:r>
+        <w:t xml:space="preserve"> </w:t>
+      </w:r>
+      <w:r>
+        <w:rPr>
+          <w:cs/>
+        </w:rPr>
+        <w:t>เพื่อกลับไปหน้าหลักของโปรเจกต์</w:t>
+      </w:r>
+      <w:r>
+        <w:t xml:space="preserve"> </w:t>
+      </w:r>
+    </w:p>
+    <w:p>
+      <w:r>
+        <w:t>PNG</w:t>
+      </w:r>
+    </w:p>
+    <w:p>
+      <w:pPr>
+        <w:numPr>
+          <w:ilvl w:val="0"/>
+          <w:numId w:val="8"/>
+        </w:numPr>
+      </w:pPr>
+      <w:r>
+        <w:rPr>
+          <w:b/>
+          <w:bCs/>
+          <w:cs/>
+        </w:rPr>
+        <w:t xml:space="preserve">ดู </w:t>
+      </w:r>
+      <w:r>
+        <w:rPr>
+          <w:b/>
+          <w:bCs/>
+        </w:rPr>
+        <w:t xml:space="preserve">URL </w:t>
+      </w:r>
+      <w:r>
+        <w:rPr>
+          <w:b/>
+          <w:bCs/>
+          <w:cs/>
+        </w:rPr>
+        <w:t>ใต้ชื่อเว็บ:</w:t>
+      </w:r>
+    </w:p>
+    <w:p>
+      <w:pPr>
+        <w:numPr>
+          <w:ilvl w:val="1"/>
+          <w:numId w:val="8"/>
+        </w:numPr>
+      </w:pPr>
+      <w:r>
+        <w:rPr>
+          <w:cs/>
+        </w:rPr>
+        <w:lastRenderedPageBreak/>
+        <w:t>ใต้ชื่อ</w:t>
+      </w:r>
+      <w:r>
+        <w:t xml:space="preserve"> family-finance-v2 </w:t>
+      </w:r>
+      <w:r>
+        <w:rPr>
+          <w:cs/>
+        </w:rPr>
+        <w:t>จะมีลิงก์สีฟ้าปรากฏขึ้น (รูปแบบจะเป็น</w:t>
+      </w:r>
+      <w:r>
+        <w:t xml:space="preserve"> [https://family-finance-v2.onrender.com](https://family-finance-v2.onrender.com) </w:t>
+      </w:r>
+      <w:r>
+        <w:rPr>
+          <w:cs/>
+        </w:rPr>
+        <w:t>หรือใกล้เคียง)</w:t>
+      </w:r>
+    </w:p>
+    <w:p>
+      <w:pPr>
+        <w:numPr>
+          <w:ilvl w:val="1"/>
+          <w:numId w:val="8"/>
+        </w:numPr>
+      </w:pPr>
+      <w:r>
+        <w:rPr>
+          <w:cs/>
+        </w:rPr>
+        <w:t>คลิกลิงก์นั้นเพื่อเปิดใช้งานหน้าเว็บจริง หรือคัดลอกส่งให้คนอื่นเปิดได้ทันทีเลยครับ</w:t>
+      </w:r>
+    </w:p>
+    <w:p>
+      <w:r>
+        <w:rPr>
+          <w:cs/>
+        </w:rPr>
+        <w:t>ลองกดเข้าไปดูหน้าเว็บจริงได้เลยครับ หากเปิดมาแล้วหน้าตาสวยงาม หรือพบจุดที่สไตล์ยังไม่ขึ้น แจ้งได้เลยนะครับ!</w:t>
+      </w:r>
+    </w:p>
+    <w:p>
+      <w:r>
+        <w:rPr>
+          <w:cs/>
+        </w:rPr>
+        <w:t>ตอนนี้โฟลเดอร์</w:t>
+      </w:r>
+      <w:r>
+        <w:t xml:space="preserve"> css/ </w:t>
+      </w:r>
+      <w:r>
+        <w:rPr>
+          <w:cs/>
+        </w:rPr>
+        <w:t>และ</w:t>
+      </w:r>
+      <w:r>
+        <w:t xml:space="preserve"> js/modules/ </w:t>
+      </w:r>
+      <w:r>
+        <w:rPr>
+          <w:cs/>
+        </w:rPr>
+        <w:t xml:space="preserve">ใน </w:t>
+      </w:r>
+      <w:r>
+        <w:t xml:space="preserve">GitHub </w:t>
+      </w:r>
+      <w:r>
+        <w:rPr>
+          <w:cs/>
+        </w:rPr>
+        <w:t>จะถูกจัดวางถูกต้องตามเครื่องของคุณแล้ว</w:t>
+      </w:r>
+      <w:r>
+        <w:t xml:space="preserve"> </w:t>
+      </w:r>
+      <w:r>
+        <w:rPr>
+          <w:cs/>
+        </w:rPr>
+        <w:t>และระบบของ</w:t>
+      </w:r>
+      <w:r>
+        <w:t xml:space="preserve"> </w:t>
+      </w:r>
+      <w:r>
+        <w:rPr>
+          <w:b/>
+          <w:bCs/>
+        </w:rPr>
+        <w:t>Render</w:t>
+      </w:r>
+      <w:r>
+        <w:t xml:space="preserve"> </w:t>
+      </w:r>
+      <w:r>
+        <w:rPr>
+          <w:cs/>
+        </w:rPr>
+        <w:t xml:space="preserve">จะตรวจพบโค้ดชุดใหม่นี้และเริ่ม </w:t>
+      </w:r>
+      <w:r>
+        <w:t xml:space="preserve">Auto-Deploy </w:t>
+      </w:r>
+      <w:r>
+        <w:rPr>
+          <w:cs/>
+        </w:rPr>
+        <w:t>ให้อัตโนมัติทันทีครับ</w:t>
+      </w:r>
+      <w:r>
+        <w:t xml:space="preserve"> </w:t>
+      </w:r>
+    </w:p>
+    <w:p>
+      <w:r>
+        <w:t>PNG</w:t>
+      </w:r>
+    </w:p>
+    <w:p>
+      <w:pPr>
+        <w:rPr>
+          <w:b/>
+          <w:bCs/>
+        </w:rPr>
+      </w:pPr>
+      <w:r>
+        <w:rPr>
+          <w:b/>
+          <w:bCs/>
+          <w:cs/>
+        </w:rPr>
+        <w:t>ขั้นตอนการเข้าไปดูหน้าเว็บจริง</w:t>
+      </w:r>
+    </w:p>
+    <w:p>
+      <w:pPr>
+        <w:numPr>
+          <w:ilvl w:val="0"/>
+          <w:numId w:val="9"/>
+        </w:numPr>
+      </w:pPr>
+      <w:r>
+        <w:rPr>
+          <w:cs/>
+        </w:rPr>
+        <w:t>กลับไปที่แท็บหน้าจอ</w:t>
+      </w:r>
+      <w:r>
+        <w:t xml:space="preserve"> </w:t>
+      </w:r>
+      <w:r>
+        <w:rPr>
+          <w:b/>
+          <w:bCs/>
+        </w:rPr>
+        <w:t>Render</w:t>
+      </w:r>
+      <w:r>
+        <w:t xml:space="preserve"> (</w:t>
+      </w:r>
+      <w:r>
+        <w:rPr>
+          <w:cs/>
+        </w:rPr>
+        <w:t>บนเบราว์เซอร์)</w:t>
+      </w:r>
+    </w:p>
+    <w:p>
+      <w:pPr>
+        <w:numPr>
+          <w:ilvl w:val="0"/>
+          <w:numId w:val="9"/>
+        </w:numPr>
+      </w:pPr>
+      <w:r>
+        <w:rPr>
+          <w:cs/>
+        </w:rPr>
+        <w:t>คลิกที่ชื่อโปรเจกต์</w:t>
+      </w:r>
+      <w:r>
+        <w:t xml:space="preserve"> </w:t>
+      </w:r>
+      <w:r>
+        <w:rPr>
+          <w:b/>
+          <w:bCs/>
+        </w:rPr>
+        <w:t>family-finance-v2</w:t>
+      </w:r>
+      <w:r>
+        <w:t xml:space="preserve"> </w:t>
+      </w:r>
+      <w:r>
+        <w:rPr>
+          <w:cs/>
+        </w:rPr>
+        <w:t xml:space="preserve">ที่เมนูด้านซ้ายบน (ใต้คำว่า </w:t>
+      </w:r>
+      <w:r>
+        <w:t xml:space="preserve">Dashboard) </w:t>
+      </w:r>
+    </w:p>
+    <w:p>
+      <w:r>
+        <w:t>PNG</w:t>
+      </w:r>
+    </w:p>
+    <w:p>
+      <w:pPr>
+        <w:numPr>
+          <w:ilvl w:val="0"/>
+          <w:numId w:val="9"/>
+        </w:numPr>
+      </w:pPr>
+      <w:r>
+        <w:rPr>
+          <w:cs/>
+        </w:rPr>
+        <w:t>สังเกตใต้ชื่อโปรเจกต์ จะมี</w:t>
+      </w:r>
+      <w:r>
+        <w:t xml:space="preserve"> </w:t>
+      </w:r>
+      <w:r>
+        <w:rPr>
+          <w:b/>
+          <w:bCs/>
+          <w:cs/>
+        </w:rPr>
+        <w:t xml:space="preserve">ลิงก์ </w:t>
+      </w:r>
+      <w:r>
+        <w:rPr>
+          <w:b/>
+          <w:bCs/>
+        </w:rPr>
+        <w:t xml:space="preserve">URL </w:t>
+      </w:r>
+      <w:r>
+        <w:rPr>
+          <w:b/>
+          <w:bCs/>
+          <w:cs/>
+        </w:rPr>
+        <w:t>สีฟ้า</w:t>
+      </w:r>
+      <w:r>
+        <w:t xml:space="preserve"> </w:t>
+      </w:r>
+      <w:r>
+        <w:rPr>
+          <w:cs/>
+        </w:rPr>
+        <w:t>ปรากฏอยู่ (รูปแบบจะเป็น</w:t>
+      </w:r>
+      <w:r>
+        <w:t xml:space="preserve"> [https://family-finance-v2.onrender.com](https://family-finance-v2.onrender.com) </w:t>
+      </w:r>
+      <w:r>
+        <w:rPr>
+          <w:cs/>
+        </w:rPr>
+        <w:t>หรือใกล้เคียง)</w:t>
+      </w:r>
+    </w:p>
+    <w:p>
+      <w:pPr>
+        <w:numPr>
+          <w:ilvl w:val="0"/>
+          <w:numId w:val="9"/>
+        </w:numPr>
+      </w:pPr>
+      <w:r>
+        <w:rPr>
+          <w:cs/>
+        </w:rPr>
+        <w:t>คลิกลิงก์นั้นเพื่อเปิดใช้งานหน้าเว็บจริงได้เลยครับ</w:t>
+      </w:r>
+    </w:p>
+    <w:p>
+      <w:r>
+        <w:rPr>
+          <w:b/>
+          <w:bCs/>
+          <w:cs/>
+        </w:rPr>
+        <w:t>วิธีตรวจเช็กว่าสำเร็จ:</w:t>
+      </w:r>
+      <w:r>
+        <w:t xml:space="preserve"> </w:t>
+      </w:r>
+      <w:r>
+        <w:rPr>
+          <w:cs/>
+        </w:rPr>
+        <w:t>เมื่อหน้าเว็บเปิดขึ้นมา สไตล์สีสัน (</w:t>
+      </w:r>
+      <w:r>
+        <w:t xml:space="preserve">CSS) </w:t>
+      </w:r>
+      <w:r>
+        <w:rPr>
+          <w:cs/>
+        </w:rPr>
+        <w:t>และฟังก์ชันต่าง ๆ จะแสดงผลสวยงามครบถ้วนเหมือนที่เปิดดูในเครื่องคอมพิวเตอร์ของคุณครับ สามารถนำลิงก์นี้ส่งให้คนอื่นเปิดใช้งานได้ทันทีเลยครับ</w:t>
+      </w:r>
+    </w:p>
+    <w:p>
+      <w:r>
+        <w:rPr>
+          <w:cs/>
+        </w:rPr>
+        <w:t>การแก้ไขไฟล์ในไดรฟ์</w:t>
+      </w:r>
+      <w:r>
+        <w:t xml:space="preserve"> D: </w:t>
+      </w:r>
+      <w:r>
+        <w:rPr>
+          <w:cs/>
+        </w:rPr>
+        <w:t xml:space="preserve">จะมีผลหรือไม่นั้น แยกออกเป็น </w:t>
+      </w:r>
+      <w:r>
+        <w:t xml:space="preserve">2 </w:t>
+      </w:r>
+      <w:r>
+        <w:rPr>
+          <w:cs/>
+        </w:rPr>
+        <w:t>กรณีครับ:</w:t>
+      </w:r>
+    </w:p>
+    <w:p>
+      <w:pPr>
+        <w:rPr>
+          <w:b/>
+          <w:bCs/>
+        </w:rPr>
+      </w:pPr>
+      <w:r>
+        <w:rPr>
+          <w:b/>
+          <w:bCs/>
+        </w:rPr>
+        <w:t xml:space="preserve">1. </w:t>
+      </w:r>
+      <w:r>
+        <w:rPr>
+          <w:b/>
+          <w:bCs/>
+          <w:cs/>
+        </w:rPr>
+        <w:t>ถ้าเปิดไฟล์ดูในเครื่องตัวเอง (</w:t>
+      </w:r>
+      <w:r>
+        <w:rPr>
+          <w:b/>
+          <w:bCs/>
+        </w:rPr>
+        <w:t>Offline / Local)</w:t>
+      </w:r>
+    </w:p>
+    <w:p>
+      <w:pPr>
+        <w:numPr>
+          <w:ilvl w:val="0"/>
+          <w:numId w:val="10"/>
+        </w:numPr>
+      </w:pPr>
+      <w:r>
+        <w:rPr>
+          <w:b/>
+          <w:bCs/>
+          <w:cs/>
+        </w:rPr>
+        <w:t>มีผลทันทีครับ:</w:t>
+      </w:r>
+      <w:r>
+        <w:t xml:space="preserve"> </w:t>
+      </w:r>
+      <w:r>
+        <w:rPr>
+          <w:cs/>
+        </w:rPr>
+        <w:t>เมื่อคุณแก้ไขไฟล์ (</w:t>
+      </w:r>
+      <w:r>
+        <w:t xml:space="preserve">HTML, CSS </w:t>
+      </w:r>
+      <w:r>
+        <w:rPr>
+          <w:cs/>
+        </w:rPr>
+        <w:t xml:space="preserve">หรือ </w:t>
+      </w:r>
+      <w:r>
+        <w:t xml:space="preserve">JS) </w:t>
+      </w:r>
+      <w:r>
+        <w:rPr>
+          <w:cs/>
+        </w:rPr>
+        <w:t>ในไดรฟ์</w:t>
+      </w:r>
+      <w:r>
+        <w:t xml:space="preserve"> D: </w:t>
+      </w:r>
+      <w:r>
+        <w:rPr>
+          <w:cs/>
+        </w:rPr>
+        <w:t xml:space="preserve">แล้วกด </w:t>
+      </w:r>
+      <w:r>
+        <w:t xml:space="preserve">Save </w:t>
+      </w:r>
+      <w:r>
+        <w:rPr>
+          <w:cs/>
+        </w:rPr>
+        <w:t>จากนั้นกดรีเฟรชหน้าเบราว์เซอร์ที่เปิดไฟล์นั้นอยู่ หน้าตาและฟังก์ชันจะเปลี่ยนทันที</w:t>
+      </w:r>
+    </w:p>
+    <w:p>
+      <w:pPr>
+        <w:rPr>
+          <w:b/>
+          <w:bCs/>
+        </w:rPr>
+      </w:pPr>
+      <w:r>
+        <w:rPr>
+          <w:b/>
+          <w:bCs/>
+        </w:rPr>
+        <w:t xml:space="preserve">2. </w:t>
+      </w:r>
+      <w:r>
+        <w:rPr>
+          <w:b/>
+          <w:bCs/>
+          <w:cs/>
+        </w:rPr>
+        <w:t xml:space="preserve">ถ้าดูผ่านหน้าเว็บออนไลน์บน </w:t>
+      </w:r>
+      <w:r>
+        <w:rPr>
+          <w:b/>
+          <w:bCs/>
+        </w:rPr>
+        <w:t>Render (onrender.com)</w:t>
+      </w:r>
+    </w:p>
+    <w:p>
+      <w:pPr>
+        <w:numPr>
+          <w:ilvl w:val="0"/>
+          <w:numId w:val="11"/>
+        </w:numPr>
+      </w:pPr>
+      <w:r>
+        <w:rPr>
+          <w:b/>
+          <w:bCs/>
+          <w:cs/>
+        </w:rPr>
+        <w:lastRenderedPageBreak/>
+        <w:t>ยังไม่มีผลทันทีครับ:</w:t>
+      </w:r>
+      <w:r>
+        <w:t xml:space="preserve"> </w:t>
+      </w:r>
+      <w:r>
+        <w:rPr>
+          <w:cs/>
+        </w:rPr>
+        <w:t xml:space="preserve">การแก้ไฟล์ในคอมพิวเตอร์ของคุณ ตัวเว็บ </w:t>
+      </w:r>
+      <w:r>
+        <w:t xml:space="preserve">Render </w:t>
+      </w:r>
+      <w:r>
+        <w:rPr>
+          <w:cs/>
+        </w:rPr>
+        <w:t xml:space="preserve">จะยังไม่รู้เรื่อง เพราะ </w:t>
+      </w:r>
+      <w:r>
+        <w:t xml:space="preserve">Render </w:t>
+      </w:r>
+      <w:r>
+        <w:rPr>
+          <w:cs/>
+        </w:rPr>
+        <w:t xml:space="preserve">ดึงโค้ดมาจาก </w:t>
+      </w:r>
+      <w:r>
+        <w:t xml:space="preserve">GitHub </w:t>
+      </w:r>
+      <w:r>
+        <w:rPr>
+          <w:cs/>
+        </w:rPr>
+        <w:t>โดยตรง</w:t>
+      </w:r>
+    </w:p>
+    <w:p>
+      <w:pPr>
+        <w:numPr>
+          <w:ilvl w:val="0"/>
+          <w:numId w:val="11"/>
+        </w:numPr>
+      </w:pPr>
+      <w:r>
+        <w:rPr>
+          <w:b/>
+          <w:bCs/>
+          <w:cs/>
+        </w:rPr>
+        <w:t>วิธีทำให้หน้าเว็บออนไลน์เปลี่ยนตาม:</w:t>
+      </w:r>
+      <w:r>
+        <w:t xml:space="preserve"> </w:t>
+      </w:r>
+      <w:r>
+        <w:rPr>
+          <w:cs/>
+        </w:rPr>
+        <w:t xml:space="preserve">คุณต้องส่งโค้ดใหม่ขึ้น </w:t>
+      </w:r>
+      <w:r>
+        <w:t xml:space="preserve">GitHub </w:t>
+      </w:r>
+      <w:r>
+        <w:rPr>
+          <w:cs/>
+        </w:rPr>
+        <w:t xml:space="preserve">ก่อน โดยเปิด </w:t>
+      </w:r>
+      <w:r>
+        <w:t xml:space="preserve">Terminal </w:t>
+      </w:r>
+      <w:r>
+        <w:rPr>
+          <w:cs/>
+        </w:rPr>
+        <w:t xml:space="preserve">ใน </w:t>
+      </w:r>
+      <w:r>
+        <w:t xml:space="preserve">VS Code </w:t>
+      </w:r>
+      <w:r>
+        <w:rPr>
+          <w:cs/>
+        </w:rPr>
+        <w:t xml:space="preserve">แล้วพิมพ์ </w:t>
+      </w:r>
+      <w:r>
+        <w:t xml:space="preserve">3 </w:t>
+      </w:r>
+      <w:r>
+        <w:rPr>
+          <w:cs/>
+        </w:rPr>
+        <w:t>คำสั่งนี้:</w:t>
+      </w:r>
+    </w:p>
+    <w:p>
+      <w:r>
+        <w:t>Bash</w:t>
+      </w:r>
+    </w:p>
+    <w:p>
+      <w:r>
+        <w:t>git add .</w:t>
+      </w:r>
+    </w:p>
+    <w:p>
+      <w:r>
+        <w:t>git commit -m "update code"</w:t>
+      </w:r>
+    </w:p>
+    <w:p>
+      <w:r>
+        <w:t>git push origin main</w:t>
+      </w:r>
+    </w:p>
+    <w:p/>
     <w:p>
       <w:pPr>
         <w:rPr>
           <w:rFonts w:hint="cs"/>
-        </w:rPr>
-      </w:pPr>
-    </w:p>
+          <w:cs/>
+        </w:rPr>
+      </w:pPr>
+    </w:p>
+    <w:p/>
+    <w:p>
+      <w:pPr>
+        <w:rPr>
+          <w:rFonts w:hint="cs"/>
+          <w:cs/>
+        </w:rPr>
+      </w:pPr>
+    </w:p>
+    <w:p/>
+    <w:p/>
+    <w:p/>
+    <w:p/>
+    <w:p/>
+    <w:p/>
+    <w:p/>
+    <w:p/>
+    <w:p/>
+    <w:p>
+      <w:r>
+        <w:rPr>
+          <w:rFonts w:cs="Cordia New"/>
+          <w:cs/>
+        </w:rPr>
+        <w:lastRenderedPageBreak/>
+        <w:drawing>
+          <wp:inline distT="0" distB="0" distL="0" distR="0" wp14:anchorId="3DC6780D" wp14:editId="04B85B66">
+            <wp:extent cx="5943600" cy="4919980"/>
+            <wp:effectExtent l="0" t="0" r="0" b="0"/>
+            <wp:docPr id="416041828" name="Picture 1"/>
+            <wp:cNvGraphicFramePr>
+              <a:graphicFrameLocks xmlns:a="http://schemas.openxmlformats.org/drawingml/2006/main" noChangeAspect="1"/>
+            </wp:cNvGraphicFramePr>
+            <a:graphic xmlns:a="http://schemas.openxmlformats.org/drawingml/2006/main">
+              <a:graphicData uri="http://schemas.openxmlformats.org/drawingml/2006/picture">
+                <pic:pic xmlns:pic="http://schemas.openxmlformats.org/drawingml/2006/picture">
+                  <pic:nvPicPr>
+                    <pic:cNvPr id="416041828" name=""/>
+                    <pic:cNvPicPr/>
+                  </pic:nvPicPr>
+                  <pic:blipFill>
+                    <a:blip r:embed="rId8"/>
+                    <a:stretch>
+                      <a:fillRect/>
+                    </a:stretch>
+                  </pic:blipFill>
+                  <pic:spPr>
+                    <a:xfrm>
+                      <a:off x="0" y="0"/>
+                      <a:ext cx="5943600" cy="4919980"/>
+                    </a:xfrm>
+                    <a:prstGeom prst="rect">
+                      <a:avLst/>
+                    </a:prstGeom>
+                  </pic:spPr>
+                </pic:pic>
+              </a:graphicData>
+            </a:graphic>
+          </wp:inline>
+        </w:drawing>
+      </w:r>
+    </w:p>
+    <w:p>
+      <w:r>
+        <w:rPr>
+          <w:rFonts w:cs="Cordia New"/>
+          <w:cs/>
+        </w:rPr>
+        <w:lastRenderedPageBreak/>
+        <w:drawing>
+          <wp:inline distT="0" distB="0" distL="0" distR="0" wp14:anchorId="6FF9ADFE" wp14:editId="784F66FF">
+            <wp:extent cx="5943600" cy="5401945"/>
+            <wp:effectExtent l="0" t="0" r="0" b="8255"/>
+            <wp:docPr id="2052215193" name="Picture 1"/>
+            <wp:cNvGraphicFramePr>
+              <a:graphicFrameLocks xmlns:a="http://schemas.openxmlformats.org/drawingml/2006/main" noChangeAspect="1"/>
+            </wp:cNvGraphicFramePr>
+            <a:graphic xmlns:a="http://schemas.openxmlformats.org/drawingml/2006/main">
+              <a:graphicData uri="http://schemas.openxmlformats.org/drawingml/2006/picture">
+                <pic:pic xmlns:pic="http://schemas.openxmlformats.org/drawingml/2006/picture">
+                  <pic:nvPicPr>
+                    <pic:cNvPr id="2052215193" name=""/>
+                    <pic:cNvPicPr/>
+                  </pic:nvPicPr>
+                  <pic:blipFill>
+                    <a:blip r:embed="rId9"/>
+                    <a:stretch>
+                      <a:fillRect/>
+                    </a:stretch>
+                  </pic:blipFill>
+                  <pic:spPr>
+                    <a:xfrm>
+                      <a:off x="0" y="0"/>
+                      <a:ext cx="5943600" cy="5401945"/>
+                    </a:xfrm>
+                    <a:prstGeom prst="rect">
+                      <a:avLst/>
+                    </a:prstGeom>
+                  </pic:spPr>
+                </pic:pic>
+              </a:graphicData>
+            </a:graphic>
+          </wp:inline>
+        </w:drawing>
+      </w:r>
+    </w:p>
+    <w:p>
+      <w:pPr>
+        <w:rPr>
+          <w:rFonts w:cs="Cordia New"/>
+        </w:rPr>
+      </w:pPr>
+      <w:r>
+        <w:t xml:space="preserve">PW : </w:t>
+      </w:r>
+      <w:r>
+        <w:t>P@ssw</w:t>
+      </w:r>
+      <w:r>
+        <w:rPr>
+          <w:rFonts w:cs="Cordia New"/>
+          <w:cs/>
+        </w:rPr>
+        <w:t>1</w:t>
+      </w:r>
+      <w:r>
+        <w:t>rd</w:t>
+      </w:r>
+      <w:r>
+        <w:rPr>
+          <w:rFonts w:cs="Cordia New"/>
+          <w:cs/>
+        </w:rPr>
+        <w:t>2511</w:t>
+      </w:r>
+    </w:p>
+    <w:p>
+      <w:pPr>
+        <w:rPr>
+          <w:rFonts w:hint="cs"/>
+        </w:rPr>
+      </w:pPr>
+    </w:p>
+    <w:p>
+      <w:r>
+        <w:lastRenderedPageBreak/>
+        <w:drawing>
+          <wp:inline distT="0" distB="0" distL="0" distR="0" wp14:anchorId="083C6610" wp14:editId="59AA55B8">
+            <wp:extent cx="5943600" cy="3823335"/>
+            <wp:effectExtent l="0" t="0" r="0" b="5715"/>
+            <wp:docPr id="1167417969" name="Picture 1"/>
+            <wp:cNvGraphicFramePr>
+              <a:graphicFrameLocks xmlns:a="http://schemas.openxmlformats.org/drawingml/2006/main" noChangeAspect="1"/>
+            </wp:cNvGraphicFramePr>
+            <a:graphic xmlns:a="http://schemas.openxmlformats.org/drawingml/2006/main">
+              <a:graphicData uri="http://schemas.openxmlformats.org/drawingml/2006/picture">
+                <pic:pic xmlns:pic="http://schemas.openxmlformats.org/drawingml/2006/picture">
+                  <pic:nvPicPr>
+                    <pic:cNvPr id="1167417969" name=""/>
+                    <pic:cNvPicPr/>
+                  </pic:nvPicPr>
+                  <pic:blipFill>
+                    <a:blip r:embed="rId10"/>
+                    <a:stretch>
+                      <a:fillRect/>
+                    </a:stretch>
+                  </pic:blipFill>
+                  <pic:spPr>
+                    <a:xfrm>
+                      <a:off x="0" y="0"/>
+                      <a:ext cx="5943600" cy="3823335"/>
+                    </a:xfrm>
+                    <a:prstGeom prst="rect">
+                      <a:avLst/>
+                    </a:prstGeom>
+                  </pic:spPr>
+                </pic:pic>
+              </a:graphicData>
+            </a:graphic>
+          </wp:inline>
+        </w:drawing>
+      </w:r>
+    </w:p>
+    <w:p>
+      <w:r>
+        <w:drawing>
+          <wp:inline distT="0" distB="0" distL="0" distR="0" wp14:anchorId="522B7E9B" wp14:editId="3301747B">
+            <wp:extent cx="5943600" cy="3639820"/>
+            <wp:effectExtent l="0" t="0" r="0" b="0"/>
+            <wp:docPr id="1060792787" name="Picture 1"/>
+            <wp:cNvGraphicFramePr>
+              <a:graphicFrameLocks xmlns:a="http://schemas.openxmlformats.org/drawingml/2006/main" noChangeAspect="1"/>
+            </wp:cNvGraphicFramePr>
+            <a:graphic xmlns:a="http://schemas.openxmlformats.org/drawingml/2006/main">
+              <a:graphicData uri="http://schemas.openxmlformats.org/drawingml/2006/picture">
+                <pic:pic xmlns:pic="http://schemas.openxmlformats.org/drawingml/2006/picture">
+                  <pic:nvPicPr>
+                    <pic:cNvPr id="1060792787" name=""/>
+                    <pic:cNvPicPr/>
+                  </pic:nvPicPr>
+                  <pic:blipFill>
+                    <a:blip r:embed="rId11"/>
+                    <a:stretch>
+                      <a:fillRect/>
+                    </a:stretch>
+                  </pic:blipFill>
+                  <pic:spPr>
+                    <a:xfrm>
+                      <a:off x="0" y="0"/>
+                      <a:ext cx="5943600" cy="3639820"/>
+                    </a:xfrm>
+                    <a:prstGeom prst="rect">
+                      <a:avLst/>
+                    </a:prstGeom>
+                  </pic:spPr>
+                </pic:pic>
+              </a:graphicData>
+            </a:graphic>
+          </wp:inline>
+        </w:drawing>
+      </w:r>
+    </w:p>
+    <w:p>
+      <w:hyperlink r:id="rId12" w:history="1">
+        <w:r>
+          <w:rPr>
+            <w:rStyle w:val="Hyperlink"/>
+          </w:rPr>
+          <w:t>https://kluefrvavvyhtswsvxee.supabase.co/rest/v1/</w:t>
+        </w:r>
+      </w:hyperlink>
+    </w:p>
+    <w:p>
+      <w:r>
+        <w:lastRenderedPageBreak/>
+        <w:drawing>
+          <wp:inline distT="0" distB="0" distL="0" distR="0" wp14:anchorId="5D9A5797" wp14:editId="06FEC7AA">
+            <wp:extent cx="5943600" cy="3836670"/>
+            <wp:effectExtent l="0" t="0" r="0" b="0"/>
+            <wp:docPr id="1937115412" name="Picture 1"/>
+            <wp:cNvGraphicFramePr>
+              <a:graphicFrameLocks xmlns:a="http://schemas.openxmlformats.org/drawingml/2006/main" noChangeAspect="1"/>
+            </wp:cNvGraphicFramePr>
+            <a:graphic xmlns:a="http://schemas.openxmlformats.org/drawingml/2006/main">
+              <a:graphicData uri="http://schemas.openxmlformats.org/drawingml/2006/picture">
+                <pic:pic xmlns:pic="http://schemas.openxmlformats.org/drawingml/2006/picture">
+                  <pic:nvPicPr>
+                    <pic:cNvPr id="1937115412" name=""/>
+                    <pic:cNvPicPr/>
+                  </pic:nvPicPr>
+                  <pic:blipFill>
+                    <a:blip r:embed="rId13"/>
+                    <a:stretch>
+                      <a:fillRect/>
+                    </a:stretch>
+                  </pic:blipFill>
+                  <pic:spPr>
+                    <a:xfrm>
+                      <a:off x="0" y="0"/>
+                      <a:ext cx="5943600" cy="3836670"/>
+                    </a:xfrm>
+                    <a:prstGeom prst="rect">
+                      <a:avLst/>
+                    </a:prstGeom>
+                  </pic:spPr>
+                </pic:pic>
+              </a:graphicData>
+            </a:graphic>
+          </wp:inline>
+        </w:drawing>
+      </w:r>
+    </w:p>
+    <w:p>
+      <w:r>
+        <w:t>sb_publishable_KHfOsEWDCW6RyV-Mbx_v6w_pyUtOR03</w:t>
+      </w:r>
+    </w:p>
+    <w:p/>
     <w:p>
       <w:pPr>
         <w:rPr>
@@ -1713,6 +3466,304 @@
 <file path=word/numbering.xml><?xml version="1.0" encoding="utf-8"?>
 <w:numbering xmlns:wpc="http://schemas.microsoft.com/office/word/2010/wordprocessingCanvas" xmlns:cx="http://schemas.microsoft.com/office/drawing/2014/chartex" xmlns:cx1="http://schemas.microsoft.com/office/drawing/2015/9/8/chartex" xmlns:cx2="http://schemas.microsoft.com/office/drawing/2015/10/21/chartex" xmlns:cx3="http://schemas.microsoft.com/office/drawing/2016/5/9/chartex" xmlns:cx4="http://schemas.microsoft.com/office/drawing/2016/5/10/chartex" xmlns:cx5="http://schemas.microsoft.com/office/drawing/2016/5/11/chartex" xmlns:cx6="http://schemas.microsoft.com/office/drawing/2016/5/12/chartex" xmlns:cx7="http://schemas.microsoft.com/office/drawing/2016/5/13/chartex" xmlns:cx8="http://schemas.microsoft.com/office/drawing/2016/5/14/chartex" xmlns:mc="http://schemas.openxmlformats.org/markup-compatibility/2006" xmlns:aink="http://schemas.microsoft.com/office/drawing/2016/ink" xmlns:am3d="http://schemas.microsoft.com/office/drawing/2017/model3d" xmlns:o="urn:schemas-microsoft-com:office:office" xmlns:oel="http://schemas.microsoft.com/office/2019/extlst" xmlns:r="http://schemas.openxmlformats.org/officeDocument/2006/relationships" xmlns:m="http://schemas.openxmlformats.org/officeDocument/2006/math" xmlns:v="urn:schemas-microsoft-com:vml" xmlns:wp14="http://schemas.microsoft.com/office/word/2010/wordprocessingDrawing" xmlns:wp="http://schemas.openxmlformats.org/drawingml/2006/wordprocessingDrawing" xmlns:w10="urn:schemas-microsoft-com:office:word" xmlns:w="http://schemas.openxmlformats.org/wordprocessingml/2006/main" xmlns:w14="http://schemas.microsoft.com/office/word/2010/wordml" xmlns:w15="http://schemas.microsoft.com/office/word/2012/wordml" xmlns:w16cex="http://schemas.microsoft.com/office/word/2018/wordml/cex" xmlns:w16cid="http://schemas.microsoft.com/office/word/2016/wordml/cid" xmlns:w16="http://schemas.microsoft.com/office/word/2018/wordml" xmlns:w16du="http://schemas.microsoft.com/office/word/2023/wordml/word16du" xmlns:w16sdtdh="http://schemas.microsoft.com/office/word/2020/wordml/sdtdatahash" xmlns:w16sdtfl="http://schemas.microsoft.com/office/word/2024/wordml/sdtformatlock" xmlns:w16se="http://schemas.microsoft.com/office/word/2015/wordml/symex" xmlns:wpg="http://schemas.microsoft.com/office/word/2010/wordprocessingGroup" xmlns:wpi="http://schemas.microsoft.com/office/word/2010/wordprocessingInk" xmlns:wne="http://schemas.microsoft.com/office/word/2006/wordml" xmlns:wps="http://schemas.microsoft.com/office/word/2010/wordprocessingShape" mc:Ignorable="w14 w15 w16se w16cid w16 w16cex w16sdtdh w16sdtfl w16du wp14">
   <w:abstractNum w:abstractNumId="0" w15:restartNumberingAfterBreak="0">
+    <w:nsid w:val="014B5A8F"/>
+    <w:multiLevelType w:val="multilevel"/>
+    <w:tmpl w:val="BCE2DCC8"/>
+    <w:lvl w:ilvl="0">
+      <w:start w:val="1"/>
+      <w:numFmt w:val="bullet"/>
+      <w:lvlText w:val=""/>
+      <w:lvlJc w:val="left"/>
+      <w:pPr>
+        <w:tabs>
+          <w:tab w:val="num" w:pos="720"/>
+        </w:tabs>
+        <w:ind w:left="720" w:hanging="360"/>
+      </w:pPr>
+      <w:rPr>
+        <w:rFonts w:ascii="Symbol" w:hAnsi="Symbol" w:hint="default"/>
+        <w:sz w:val="20"/>
+      </w:rPr>
+    </w:lvl>
+    <w:lvl w:ilvl="1" w:tentative="1">
+      <w:start w:val="1"/>
+      <w:numFmt w:val="bullet"/>
+      <w:lvlText w:val="o"/>
+      <w:lvlJc w:val="left"/>
+      <w:pPr>
+        <w:tabs>
+          <w:tab w:val="num" w:pos="1440"/>
+        </w:tabs>
+        <w:ind w:left="1440" w:hanging="360"/>
+      </w:pPr>
+      <w:rPr>
+        <w:rFonts w:ascii="Courier New" w:hAnsi="Courier New" w:hint="default"/>
+        <w:sz w:val="20"/>
+      </w:rPr>
+    </w:lvl>
+    <w:lvl w:ilvl="2" w:tentative="1">
+      <w:start w:val="1"/>
+      <w:numFmt w:val="bullet"/>
+      <w:lvlText w:val=""/>
+      <w:lvlJc w:val="left"/>
+      <w:pPr>
+        <w:tabs>
+          <w:tab w:val="num" w:pos="2160"/>
+        </w:tabs>
+        <w:ind w:left="2160" w:hanging="360"/>
+      </w:pPr>
+      <w:rPr>
+        <w:rFonts w:ascii="Wingdings" w:hAnsi="Wingdings" w:hint="default"/>
+        <w:sz w:val="20"/>
+      </w:rPr>
+    </w:lvl>
+    <w:lvl w:ilvl="3" w:tentative="1">
+      <w:start w:val="1"/>
+      <w:numFmt w:val="bullet"/>
+      <w:lvlText w:val=""/>
+      <w:lvlJc w:val="left"/>
+      <w:pPr>
+        <w:tabs>
+          <w:tab w:val="num" w:pos="2880"/>
+        </w:tabs>
+        <w:ind w:left="2880" w:hanging="360"/>
+      </w:pPr>
+      <w:rPr>
+        <w:rFonts w:ascii="Wingdings" w:hAnsi="Wingdings" w:hint="default"/>
+        <w:sz w:val="20"/>
+      </w:rPr>
+    </w:lvl>
+    <w:lvl w:ilvl="4" w:tentative="1">
+      <w:start w:val="1"/>
+      <w:numFmt w:val="bullet"/>
+      <w:lvlText w:val=""/>
+      <w:lvlJc w:val="left"/>
+      <w:pPr>
+        <w:tabs>
+          <w:tab w:val="num" w:pos="3600"/>
+        </w:tabs>
+        <w:ind w:left="3600" w:hanging="360"/>
+      </w:pPr>
+      <w:rPr>
+        <w:rFonts w:ascii="Wingdings" w:hAnsi="Wingdings" w:hint="default"/>
+        <w:sz w:val="20"/>
+      </w:rPr>
+    </w:lvl>
+    <w:lvl w:ilvl="5" w:tentative="1">
+      <w:start w:val="1"/>
+      <w:numFmt w:val="bullet"/>
+      <w:lvlText w:val=""/>
+      <w:lvlJc w:val="left"/>
+      <w:pPr>
+        <w:tabs>
+          <w:tab w:val="num" w:pos="4320"/>
+        </w:tabs>
+        <w:ind w:left="4320" w:hanging="360"/>
+      </w:pPr>
+      <w:rPr>
+        <w:rFonts w:ascii="Wingdings" w:hAnsi="Wingdings" w:hint="default"/>
+        <w:sz w:val="20"/>
+      </w:rPr>
+    </w:lvl>
+    <w:lvl w:ilvl="6" w:tentative="1">
+      <w:start w:val="1"/>
+      <w:numFmt w:val="bullet"/>
+      <w:lvlText w:val=""/>
+      <w:lvlJc w:val="left"/>
+      <w:pPr>
+        <w:tabs>
+          <w:tab w:val="num" w:pos="5040"/>
+        </w:tabs>
+        <w:ind w:left="5040" w:hanging="360"/>
+      </w:pPr>
+      <w:rPr>
+        <w:rFonts w:ascii="Wingdings" w:hAnsi="Wingdings" w:hint="default"/>
+        <w:sz w:val="20"/>
+      </w:rPr>
+    </w:lvl>
+    <w:lvl w:ilvl="7" w:tentative="1">
+      <w:start w:val="1"/>
+      <w:numFmt w:val="bullet"/>
+      <w:lvlText w:val=""/>
+      <w:lvlJc w:val="left"/>
+      <w:pPr>
+        <w:tabs>
+          <w:tab w:val="num" w:pos="5760"/>
+        </w:tabs>
+        <w:ind w:left="5760" w:hanging="360"/>
+      </w:pPr>
+      <w:rPr>
+        <w:rFonts w:ascii="Wingdings" w:hAnsi="Wingdings" w:hint="default"/>
+        <w:sz w:val="20"/>
+      </w:rPr>
+    </w:lvl>
+    <w:lvl w:ilvl="8" w:tentative="1">
+      <w:start w:val="1"/>
+      <w:numFmt w:val="bullet"/>
+      <w:lvlText w:val=""/>
+      <w:lvlJc w:val="left"/>
+      <w:pPr>
+        <w:tabs>
+          <w:tab w:val="num" w:pos="6480"/>
+        </w:tabs>
+        <w:ind w:left="6480" w:hanging="360"/>
+      </w:pPr>
+      <w:rPr>
+        <w:rFonts w:ascii="Wingdings" w:hAnsi="Wingdings" w:hint="default"/>
+        <w:sz w:val="20"/>
+      </w:rPr>
+    </w:lvl>
+  </w:abstractNum>
+  <w:abstractNum w:abstractNumId="1" w15:restartNumberingAfterBreak="0">
+    <w:nsid w:val="04A85624"/>
+    <w:multiLevelType w:val="multilevel"/>
+    <w:tmpl w:val="DF08C450"/>
+    <w:lvl w:ilvl="0">
+      <w:start w:val="1"/>
+      <w:numFmt w:val="bullet"/>
+      <w:lvlText w:val=""/>
+      <w:lvlJc w:val="left"/>
+      <w:pPr>
+        <w:tabs>
+          <w:tab w:val="num" w:pos="720"/>
+        </w:tabs>
+        <w:ind w:left="720" w:hanging="360"/>
+      </w:pPr>
+      <w:rPr>
+        <w:rFonts w:ascii="Symbol" w:hAnsi="Symbol" w:hint="default"/>
+        <w:sz w:val="20"/>
+      </w:rPr>
+    </w:lvl>
+    <w:lvl w:ilvl="1" w:tentative="1">
+      <w:start w:val="1"/>
+      <w:numFmt w:val="bullet"/>
+      <w:lvlText w:val="o"/>
+      <w:lvlJc w:val="left"/>
+      <w:pPr>
+        <w:tabs>
+          <w:tab w:val="num" w:pos="1440"/>
+        </w:tabs>
+        <w:ind w:left="1440" w:hanging="360"/>
+      </w:pPr>
+      <w:rPr>
+        <w:rFonts w:ascii="Courier New" w:hAnsi="Courier New" w:hint="default"/>
+        <w:sz w:val="20"/>
+      </w:rPr>
+    </w:lvl>
+    <w:lvl w:ilvl="2" w:tentative="1">
+      <w:start w:val="1"/>
+      <w:numFmt w:val="bullet"/>
+      <w:lvlText w:val=""/>
+      <w:lvlJc w:val="left"/>
+      <w:pPr>
+        <w:tabs>
+          <w:tab w:val="num" w:pos="2160"/>
+        </w:tabs>
+        <w:ind w:left="2160" w:hanging="360"/>
+      </w:pPr>
+      <w:rPr>
+        <w:rFonts w:ascii="Wingdings" w:hAnsi="Wingdings" w:hint="default"/>
+        <w:sz w:val="20"/>
+      </w:rPr>
+    </w:lvl>
+    <w:lvl w:ilvl="3" w:tentative="1">
+      <w:start w:val="1"/>
+      <w:numFmt w:val="bullet"/>
+      <w:lvlText w:val=""/>
+      <w:lvlJc w:val="left"/>
+      <w:pPr>
+        <w:tabs>
+          <w:tab w:val="num" w:pos="2880"/>
+        </w:tabs>
+        <w:ind w:left="2880" w:hanging="360"/>
+      </w:pPr>
+      <w:rPr>
+        <w:rFonts w:ascii="Wingdings" w:hAnsi="Wingdings" w:hint="default"/>
+        <w:sz w:val="20"/>
+      </w:rPr>
+    </w:lvl>
+    <w:lvl w:ilvl="4" w:tentative="1">
+      <w:start w:val="1"/>
+      <w:numFmt w:val="bullet"/>
+      <w:lvlText w:val=""/>
+      <w:lvlJc w:val="left"/>
+      <w:pPr>
+        <w:tabs>
+          <w:tab w:val="num" w:pos="3600"/>
+        </w:tabs>
+        <w:ind w:left="3600" w:hanging="360"/>
+      </w:pPr>
+      <w:rPr>
+        <w:rFonts w:ascii="Wingdings" w:hAnsi="Wingdings" w:hint="default"/>
+        <w:sz w:val="20"/>
+      </w:rPr>
+    </w:lvl>
+    <w:lvl w:ilvl="5" w:tentative="1">
+      <w:start w:val="1"/>
+      <w:numFmt w:val="bullet"/>
+      <w:lvlText w:val=""/>
+      <w:lvlJc w:val="left"/>
+      <w:pPr>
+        <w:tabs>
+          <w:tab w:val="num" w:pos="4320"/>
+        </w:tabs>
+        <w:ind w:left="4320" w:hanging="360"/>
+      </w:pPr>
+      <w:rPr>
+        <w:rFonts w:ascii="Wingdings" w:hAnsi="Wingdings" w:hint="default"/>
+        <w:sz w:val="20"/>
+      </w:rPr>
+    </w:lvl>
+    <w:lvl w:ilvl="6" w:tentative="1">
+      <w:start w:val="1"/>
+      <w:numFmt w:val="bullet"/>
+      <w:lvlText w:val=""/>
+      <w:lvlJc w:val="left"/>
+      <w:pPr>
+        <w:tabs>
+          <w:tab w:val="num" w:pos="5040"/>
+        </w:tabs>
+        <w:ind w:left="5040" w:hanging="360"/>
+      </w:pPr>
+      <w:rPr>
+        <w:rFonts w:ascii="Wingdings" w:hAnsi="Wingdings" w:hint="default"/>
+        <w:sz w:val="20"/>
+      </w:rPr>
+    </w:lvl>
+    <w:lvl w:ilvl="7" w:tentative="1">
+      <w:start w:val="1"/>
+      <w:numFmt w:val="bullet"/>
+      <w:lvlText w:val=""/>
+      <w:lvlJc w:val="left"/>
+      <w:pPr>
+        <w:tabs>
+          <w:tab w:val="num" w:pos="5760"/>
+        </w:tabs>
+        <w:ind w:left="5760" w:hanging="360"/>
+      </w:pPr>
+      <w:rPr>
+        <w:rFonts w:ascii="Wingdings" w:hAnsi="Wingdings" w:hint="default"/>
+        <w:sz w:val="20"/>
+      </w:rPr>
+    </w:lvl>
+    <w:lvl w:ilvl="8" w:tentative="1">
+      <w:start w:val="1"/>
+      <w:numFmt w:val="bullet"/>
+      <w:lvlText w:val=""/>
+      <w:lvlJc w:val="left"/>
+      <w:pPr>
+        <w:tabs>
+          <w:tab w:val="num" w:pos="6480"/>
+        </w:tabs>
+        <w:ind w:left="6480" w:hanging="360"/>
+      </w:pPr>
+      <w:rPr>
+        <w:rFonts w:ascii="Wingdings" w:hAnsi="Wingdings" w:hint="default"/>
+        <w:sz w:val="20"/>
+      </w:rPr>
+    </w:lvl>
+  </w:abstractNum>
+  <w:abstractNum w:abstractNumId="2" w15:restartNumberingAfterBreak="0">
     <w:nsid w:val="06C9024D"/>
     <w:multiLevelType w:val="multilevel"/>
     <w:tmpl w:val="DA0CA1BA"/>
@@ -1825,7 +3876,156 @@
       </w:pPr>
     </w:lvl>
   </w:abstractNum>
-  <w:abstractNum w:abstractNumId="1" w15:restartNumberingAfterBreak="0">
+  <w:abstractNum w:abstractNumId="3" w15:restartNumberingAfterBreak="0">
+    <w:nsid w:val="11AB7A08"/>
+    <w:multiLevelType w:val="multilevel"/>
+    <w:tmpl w:val="89B20404"/>
+    <w:lvl w:ilvl="0">
+      <w:start w:val="1"/>
+      <w:numFmt w:val="bullet"/>
+      <w:lvlText w:val=""/>
+      <w:lvlJc w:val="left"/>
+      <w:pPr>
+        <w:tabs>
+          <w:tab w:val="num" w:pos="720"/>
+        </w:tabs>
+        <w:ind w:left="720" w:hanging="360"/>
+      </w:pPr>
+      <w:rPr>
+        <w:rFonts w:ascii="Symbol" w:hAnsi="Symbol" w:hint="default"/>
+        <w:sz w:val="20"/>
+      </w:rPr>
+    </w:lvl>
+    <w:lvl w:ilvl="1" w:tentative="1">
+      <w:start w:val="1"/>
+      <w:numFmt w:val="bullet"/>
+      <w:lvlText w:val="o"/>
+      <w:lvlJc w:val="left"/>
+      <w:pPr>
+        <w:tabs>
+          <w:tab w:val="num" w:pos="1440"/>
+        </w:tabs>
+        <w:ind w:left="1440" w:hanging="360"/>
+      </w:pPr>
+      <w:rPr>
+        <w:rFonts w:ascii="Courier New" w:hAnsi="Courier New" w:hint="default"/>
+        <w:sz w:val="20"/>
+      </w:rPr>
+    </w:lvl>
+    <w:lvl w:ilvl="2" w:tentative="1">
+      <w:start w:val="1"/>
+      <w:numFmt w:val="bullet"/>
+      <w:lvlText w:val=""/>
+      <w:lvlJc w:val="left"/>
+      <w:pPr>
+        <w:tabs>
+          <w:tab w:val="num" w:pos="2160"/>
+        </w:tabs>
+        <w:ind w:left="2160" w:hanging="360"/>
+      </w:pPr>
+      <w:rPr>
+        <w:rFonts w:ascii="Wingdings" w:hAnsi="Wingdings" w:hint="default"/>
+        <w:sz w:val="20"/>
+      </w:rPr>
+    </w:lvl>
+    <w:lvl w:ilvl="3" w:tentative="1">
+      <w:start w:val="1"/>
+      <w:numFmt w:val="bullet"/>
+      <w:lvlText w:val=""/>
+      <w:lvlJc w:val="left"/>
+      <w:pPr>
+        <w:tabs>
+          <w:tab w:val="num" w:pos="2880"/>
+        </w:tabs>
+        <w:ind w:left="2880" w:hanging="360"/>
+      </w:pPr>
+      <w:rPr>
+        <w:rFonts w:ascii="Wingdings" w:hAnsi="Wingdings" w:hint="default"/>
+        <w:sz w:val="20"/>
+      </w:rPr>
+    </w:lvl>
+    <w:lvl w:ilvl="4" w:tentative="1">
+      <w:start w:val="1"/>
+      <w:numFmt w:val="bullet"/>
+      <w:lvlText w:val=""/>
+      <w:lvlJc w:val="left"/>
+      <w:pPr>
+        <w:tabs>
+          <w:tab w:val="num" w:pos="3600"/>
+        </w:tabs>
+        <w:ind w:left="3600" w:hanging="360"/>
+      </w:pPr>
+      <w:rPr>
+        <w:rFonts w:ascii="Wingdings" w:hAnsi="Wingdings" w:hint="default"/>
+        <w:sz w:val="20"/>
+      </w:rPr>
+    </w:lvl>
+    <w:lvl w:ilvl="5" w:tentative="1">
+      <w:start w:val="1"/>
+      <w:numFmt w:val="bullet"/>
+      <w:lvlText w:val=""/>
+      <w:lvlJc w:val="left"/>
+      <w:pPr>
+        <w:tabs>
+          <w:tab w:val="num" w:pos="4320"/>
+        </w:tabs>
+        <w:ind w:left="4320" w:hanging="360"/>
+      </w:pPr>
+      <w:rPr>
+        <w:rFonts w:ascii="Wingdings" w:hAnsi="Wingdings" w:hint="default"/>
+        <w:sz w:val="20"/>
+      </w:rPr>
+    </w:lvl>
+    <w:lvl w:ilvl="6" w:tentative="1">
+      <w:start w:val="1"/>
+      <w:numFmt w:val="bullet"/>
+      <w:lvlText w:val=""/>
+      <w:lvlJc w:val="left"/>
+      <w:pPr>
+        <w:tabs>
+          <w:tab w:val="num" w:pos="5040"/>
+        </w:tabs>
+        <w:ind w:left="5040" w:hanging="360"/>
+      </w:pPr>
+      <w:rPr>
+        <w:rFonts w:ascii="Wingdings" w:hAnsi="Wingdings" w:hint="default"/>
+        <w:sz w:val="20"/>
+      </w:rPr>
+    </w:lvl>
+    <w:lvl w:ilvl="7" w:tentative="1">
+      <w:start w:val="1"/>
+      <w:numFmt w:val="bullet"/>
+      <w:lvlText w:val=""/>
+      <w:lvlJc w:val="left"/>
+      <w:pPr>
+        <w:tabs>
+          <w:tab w:val="num" w:pos="5760"/>
+        </w:tabs>
+        <w:ind w:left="5760" w:hanging="360"/>
+      </w:pPr>
+      <w:rPr>
+        <w:rFonts w:ascii="Wingdings" w:hAnsi="Wingdings" w:hint="default"/>
+        <w:sz w:val="20"/>
+      </w:rPr>
+    </w:lvl>
+    <w:lvl w:ilvl="8" w:tentative="1">
+      <w:start w:val="1"/>
+      <w:numFmt w:val="bullet"/>
+      <w:lvlText w:val=""/>
+      <w:lvlJc w:val="left"/>
+      <w:pPr>
+        <w:tabs>
+          <w:tab w:val="num" w:pos="6480"/>
+        </w:tabs>
+        <w:ind w:left="6480" w:hanging="360"/>
+      </w:pPr>
+      <w:rPr>
+        <w:rFonts w:ascii="Wingdings" w:hAnsi="Wingdings" w:hint="default"/>
+        <w:sz w:val="20"/>
+      </w:rPr>
+    </w:lvl>
+  </w:abstractNum>
+  <w:abstractNum w:abstractNumId="4" w15:restartNumberingAfterBreak="0">
     <w:nsid w:val="143D187C"/>
     <w:multiLevelType w:val="multilevel"/>
     <w:tmpl w:val="154097B0"/>
@@ -1938,7 +4138,7 @@
       </w:pPr>
     </w:lvl>
   </w:abstractNum>
-  <w:abstractNum w:abstractNumId="2" w15:restartNumberingAfterBreak="0">
+  <w:abstractNum w:abstractNumId="5" w15:restartNumberingAfterBreak="0">
     <w:nsid w:val="15132522"/>
     <w:multiLevelType w:val="multilevel"/>
     <w:tmpl w:val="7CFC6E78"/>
@@ -2055,7 +4255,7 @@
       </w:pPr>
     </w:lvl>
   </w:abstractNum>
-  <w:abstractNum w:abstractNumId="3" w15:restartNumberingAfterBreak="0">
+  <w:abstractNum w:abstractNumId="6" w15:restartNumberingAfterBreak="0">
     <w:nsid w:val="284C271A"/>
     <w:multiLevelType w:val="multilevel"/>
     <w:tmpl w:val="B8FA02EE"/>
@@ -2204,7 +4404,535 @@
       </w:rPr>
     </w:lvl>
   </w:abstractNum>
-  <w:abstractNum w:abstractNumId="4" w15:restartNumberingAfterBreak="0">
+  <w:abstractNum w:abstractNumId="7" w15:restartNumberingAfterBreak="0">
+    <w:nsid w:val="466859A4"/>
+    <w:multiLevelType w:val="multilevel"/>
+    <w:tmpl w:val="5FA21DE6"/>
+    <w:lvl w:ilvl="0">
+      <w:start w:val="1"/>
+      <w:numFmt w:val="bullet"/>
+      <w:lvlText w:val=""/>
+      <w:lvlJc w:val="left"/>
+      <w:pPr>
+        <w:tabs>
+          <w:tab w:val="num" w:pos="720"/>
+        </w:tabs>
+        <w:ind w:left="720" w:hanging="360"/>
+      </w:pPr>
+      <w:rPr>
+        <w:rFonts w:ascii="Symbol" w:hAnsi="Symbol" w:hint="default"/>
+        <w:sz w:val="20"/>
+      </w:rPr>
+    </w:lvl>
+    <w:lvl w:ilvl="1" w:tentative="1">
+      <w:start w:val="1"/>
+      <w:numFmt w:val="bullet"/>
+      <w:lvlText w:val="o"/>
+      <w:lvlJc w:val="left"/>
+      <w:pPr>
+        <w:tabs>
+          <w:tab w:val="num" w:pos="1440"/>
+        </w:tabs>
+        <w:ind w:left="1440" w:hanging="360"/>
+      </w:pPr>
+      <w:rPr>
+        <w:rFonts w:ascii="Courier New" w:hAnsi="Courier New" w:hint="default"/>
+        <w:sz w:val="20"/>
+      </w:rPr>
+    </w:lvl>
+    <w:lvl w:ilvl="2" w:tentative="1">
+      <w:start w:val="1"/>
+      <w:numFmt w:val="bullet"/>
+      <w:lvlText w:val=""/>
+      <w:lvlJc w:val="left"/>
+      <w:pPr>
+        <w:tabs>
+          <w:tab w:val="num" w:pos="2160"/>
+        </w:tabs>
+        <w:ind w:left="2160" w:hanging="360"/>
+      </w:pPr>
+      <w:rPr>
+        <w:rFonts w:ascii="Wingdings" w:hAnsi="Wingdings" w:hint="default"/>
+        <w:sz w:val="20"/>
+      </w:rPr>
+    </w:lvl>
+    <w:lvl w:ilvl="3" w:tentative="1">
+      <w:start w:val="1"/>
+      <w:numFmt w:val="bullet"/>
+      <w:lvlText w:val=""/>
+      <w:lvlJc w:val="left"/>
+      <w:pPr>
+        <w:tabs>
+          <w:tab w:val="num" w:pos="2880"/>
+        </w:tabs>
+        <w:ind w:left="2880" w:hanging="360"/>
+      </w:pPr>
+      <w:rPr>
+        <w:rFonts w:ascii="Wingdings" w:hAnsi="Wingdings" w:hint="default"/>
+        <w:sz w:val="20"/>
+      </w:rPr>
+    </w:lvl>
+    <w:lvl w:ilvl="4" w:tentative="1">
+      <w:start w:val="1"/>
+      <w:numFmt w:val="bullet"/>
+      <w:lvlText w:val=""/>
+      <w:lvlJc w:val="left"/>
+      <w:pPr>
+        <w:tabs>
+          <w:tab w:val="num" w:pos="3600"/>
+        </w:tabs>
+        <w:ind w:left="3600" w:hanging="360"/>
+      </w:pPr>
+      <w:rPr>
+        <w:rFonts w:ascii="Wingdings" w:hAnsi="Wingdings" w:hint="default"/>
+        <w:sz w:val="20"/>
+      </w:rPr>
+    </w:lvl>
+    <w:lvl w:ilvl="5" w:tentative="1">
+      <w:start w:val="1"/>
+      <w:numFmt w:val="bullet"/>
+      <w:lvlText w:val=""/>
+      <w:lvlJc w:val="left"/>
+      <w:pPr>
+        <w:tabs>
+          <w:tab w:val="num" w:pos="4320"/>
+        </w:tabs>
+        <w:ind w:left="4320" w:hanging="360"/>
+      </w:pPr>
+      <w:rPr>
+        <w:rFonts w:ascii="Wingdings" w:hAnsi="Wingdings" w:hint="default"/>
+        <w:sz w:val="20"/>
+      </w:rPr>
+    </w:lvl>
+    <w:lvl w:ilvl="6" w:tentative="1">
+      <w:start w:val="1"/>
+      <w:numFmt w:val="bullet"/>
+      <w:lvlText w:val=""/>
+      <w:lvlJc w:val="left"/>
+      <w:pPr>
+        <w:tabs>
+          <w:tab w:val="num" w:pos="5040"/>
+        </w:tabs>
+        <w:ind w:left="5040" w:hanging="360"/>
+      </w:pPr>
+      <w:rPr>
+        <w:rFonts w:ascii="Wingdings" w:hAnsi="Wingdings" w:hint="default"/>
+        <w:sz w:val="20"/>
+      </w:rPr>
+    </w:lvl>
+    <w:lvl w:ilvl="7" w:tentative="1">
+      <w:start w:val="1"/>
+      <w:numFmt w:val="bullet"/>
+      <w:lvlText w:val=""/>
+      <w:lvlJc w:val="left"/>
+      <w:pPr>
+        <w:tabs>
+          <w:tab w:val="num" w:pos="5760"/>
+        </w:tabs>
+        <w:ind w:left="5760" w:hanging="360"/>
+      </w:pPr>
+      <w:rPr>
+        <w:rFonts w:ascii="Wingdings" w:hAnsi="Wingdings" w:hint="default"/>
+        <w:sz w:val="20"/>
+      </w:rPr>
+    </w:lvl>
+    <w:lvl w:ilvl="8" w:tentative="1">
+      <w:start w:val="1"/>
+      <w:numFmt w:val="bullet"/>
+      <w:lvlText w:val=""/>
+      <w:lvlJc w:val="left"/>
+      <w:pPr>
+        <w:tabs>
+          <w:tab w:val="num" w:pos="6480"/>
+        </w:tabs>
+        <w:ind w:left="6480" w:hanging="360"/>
+      </w:pPr>
+      <w:rPr>
+        <w:rFonts w:ascii="Wingdings" w:hAnsi="Wingdings" w:hint="default"/>
+        <w:sz w:val="20"/>
+      </w:rPr>
+    </w:lvl>
+  </w:abstractNum>
+  <w:abstractNum w:abstractNumId="8" w15:restartNumberingAfterBreak="0">
+    <w:nsid w:val="4DED3AA8"/>
+    <w:multiLevelType w:val="multilevel"/>
+    <w:tmpl w:val="E620F32A"/>
+    <w:lvl w:ilvl="0">
+      <w:start w:val="1"/>
+      <w:numFmt w:val="bullet"/>
+      <w:lvlText w:val=""/>
+      <w:lvlJc w:val="left"/>
+      <w:pPr>
+        <w:tabs>
+          <w:tab w:val="num" w:pos="720"/>
+        </w:tabs>
+        <w:ind w:left="720" w:hanging="360"/>
+      </w:pPr>
+      <w:rPr>
+        <w:rFonts w:ascii="Symbol" w:hAnsi="Symbol" w:hint="default"/>
+        <w:sz w:val="20"/>
+      </w:rPr>
+    </w:lvl>
+    <w:lvl w:ilvl="1" w:tentative="1">
+      <w:start w:val="1"/>
+      <w:numFmt w:val="bullet"/>
+      <w:lvlText w:val="o"/>
+      <w:lvlJc w:val="left"/>
+      <w:pPr>
+        <w:tabs>
+          <w:tab w:val="num" w:pos="1440"/>
+        </w:tabs>
+        <w:ind w:left="1440" w:hanging="360"/>
+      </w:pPr>
+      <w:rPr>
+        <w:rFonts w:ascii="Courier New" w:hAnsi="Courier New" w:hint="default"/>
+        <w:sz w:val="20"/>
+      </w:rPr>
+    </w:lvl>
+    <w:lvl w:ilvl="2" w:tentative="1">
+      <w:start w:val="1"/>
+      <w:numFmt w:val="bullet"/>
+      <w:lvlText w:val=""/>
+      <w:lvlJc w:val="left"/>
+      <w:pPr>
+        <w:tabs>
+          <w:tab w:val="num" w:pos="2160"/>
+        </w:tabs>
+        <w:ind w:left="2160" w:hanging="360"/>
+      </w:pPr>
+      <w:rPr>
+        <w:rFonts w:ascii="Wingdings" w:hAnsi="Wingdings" w:hint="default"/>
+        <w:sz w:val="20"/>
+      </w:rPr>
+    </w:lvl>
+    <w:lvl w:ilvl="3" w:tentative="1">
+      <w:start w:val="1"/>
+      <w:numFmt w:val="bullet"/>
+      <w:lvlText w:val=""/>
+      <w:lvlJc w:val="left"/>
+      <w:pPr>
+        <w:tabs>
+          <w:tab w:val="num" w:pos="2880"/>
+        </w:tabs>
+        <w:ind w:left="2880" w:hanging="360"/>
+      </w:pPr>
+      <w:rPr>
+        <w:rFonts w:ascii="Wingdings" w:hAnsi="Wingdings" w:hint="default"/>
+        <w:sz w:val="20"/>
+      </w:rPr>
+    </w:lvl>
+    <w:lvl w:ilvl="4" w:tentative="1">
+      <w:start w:val="1"/>
+      <w:numFmt w:val="bullet"/>
+      <w:lvlText w:val=""/>
+      <w:lvlJc w:val="left"/>
+      <w:pPr>
+        <w:tabs>
+          <w:tab w:val="num" w:pos="3600"/>
+        </w:tabs>
+        <w:ind w:left="3600" w:hanging="360"/>
+      </w:pPr>
+      <w:rPr>
+        <w:rFonts w:ascii="Wingdings" w:hAnsi="Wingdings" w:hint="default"/>
+        <w:sz w:val="20"/>
+      </w:rPr>
+    </w:lvl>
+    <w:lvl w:ilvl="5" w:tentative="1">
+      <w:start w:val="1"/>
+      <w:numFmt w:val="bullet"/>
+      <w:lvlText w:val=""/>
+      <w:lvlJc w:val="left"/>
+      <w:pPr>
+        <w:tabs>
+          <w:tab w:val="num" w:pos="4320"/>
+        </w:tabs>
+        <w:ind w:left="4320" w:hanging="360"/>
+      </w:pPr>
+      <w:rPr>
+        <w:rFonts w:ascii="Wingdings" w:hAnsi="Wingdings" w:hint="default"/>
+        <w:sz w:val="20"/>
+      </w:rPr>
+    </w:lvl>
+    <w:lvl w:ilvl="6" w:tentative="1">
+      <w:start w:val="1"/>
+      <w:numFmt w:val="bullet"/>
+      <w:lvlText w:val=""/>
+      <w:lvlJc w:val="left"/>
+      <w:pPr>
+        <w:tabs>
+          <w:tab w:val="num" w:pos="5040"/>
+        </w:tabs>
+        <w:ind w:left="5040" w:hanging="360"/>
+      </w:pPr>
+      <w:rPr>
+        <w:rFonts w:ascii="Wingdings" w:hAnsi="Wingdings" w:hint="default"/>
+        <w:sz w:val="20"/>
+      </w:rPr>
+    </w:lvl>
+    <w:lvl w:ilvl="7" w:tentative="1">
+      <w:start w:val="1"/>
+      <w:numFmt w:val="bullet"/>
+      <w:lvlText w:val=""/>
+      <w:lvlJc w:val="left"/>
+      <w:pPr>
+        <w:tabs>
+          <w:tab w:val="num" w:pos="5760"/>
+        </w:tabs>
+        <w:ind w:left="5760" w:hanging="360"/>
+      </w:pPr>
+      <w:rPr>
+        <w:rFonts w:ascii="Wingdings" w:hAnsi="Wingdings" w:hint="default"/>
+        <w:sz w:val="20"/>
+      </w:rPr>
+    </w:lvl>
+    <w:lvl w:ilvl="8" w:tentative="1">
+      <w:start w:val="1"/>
+      <w:numFmt w:val="bullet"/>
+      <w:lvlText w:val=""/>
+      <w:lvlJc w:val="left"/>
+      <w:pPr>
+        <w:tabs>
+          <w:tab w:val="num" w:pos="6480"/>
+        </w:tabs>
+        <w:ind w:left="6480" w:hanging="360"/>
+      </w:pPr>
+      <w:rPr>
+        <w:rFonts w:ascii="Wingdings" w:hAnsi="Wingdings" w:hint="default"/>
+        <w:sz w:val="20"/>
+      </w:rPr>
+    </w:lvl>
+  </w:abstractNum>
+  <w:abstractNum w:abstractNumId="9" w15:restartNumberingAfterBreak="0">
+    <w:nsid w:val="516E2B39"/>
+    <w:multiLevelType w:val="multilevel"/>
+    <w:tmpl w:val="C826DF86"/>
+    <w:lvl w:ilvl="0">
+      <w:start w:val="1"/>
+      <w:numFmt w:val="decimal"/>
+      <w:lvlText w:val="%1."/>
+      <w:lvlJc w:val="left"/>
+      <w:pPr>
+        <w:tabs>
+          <w:tab w:val="num" w:pos="720"/>
+        </w:tabs>
+        <w:ind w:left="720" w:hanging="360"/>
+      </w:pPr>
+    </w:lvl>
+    <w:lvl w:ilvl="1" w:tentative="1">
+      <w:start w:val="1"/>
+      <w:numFmt w:val="decimal"/>
+      <w:lvlText w:val="%2."/>
+      <w:lvlJc w:val="left"/>
+      <w:pPr>
+        <w:tabs>
+          <w:tab w:val="num" w:pos="1440"/>
+        </w:tabs>
+        <w:ind w:left="1440" w:hanging="360"/>
+      </w:pPr>
+    </w:lvl>
+    <w:lvl w:ilvl="2" w:tentative="1">
+      <w:start w:val="1"/>
+      <w:numFmt w:val="decimal"/>
+      <w:lvlText w:val="%3."/>
+      <w:lvlJc w:val="left"/>
+      <w:pPr>
+        <w:tabs>
+          <w:tab w:val="num" w:pos="2160"/>
+        </w:tabs>
+        <w:ind w:left="2160" w:hanging="360"/>
+      </w:pPr>
+    </w:lvl>
+    <w:lvl w:ilvl="3" w:tentative="1">
+      <w:start w:val="1"/>
+      <w:numFmt w:val="decimal"/>
+      <w:lvlText w:val="%4."/>
+      <w:lvlJc w:val="left"/>
+      <w:pPr>
+        <w:tabs>
+          <w:tab w:val="num" w:pos="2880"/>
+        </w:tabs>
+        <w:ind w:left="2880" w:hanging="360"/>
+      </w:pPr>
+    </w:lvl>
+    <w:lvl w:ilvl="4" w:tentative="1">
+      <w:start w:val="1"/>
+      <w:numFmt w:val="decimal"/>
+      <w:lvlText w:val="%5."/>
+      <w:lvlJc w:val="left"/>
+      <w:pPr>
+        <w:tabs>
+          <w:tab w:val="num" w:pos="3600"/>
+        </w:tabs>
+        <w:ind w:left="3600" w:hanging="360"/>
+      </w:pPr>
+    </w:lvl>
+    <w:lvl w:ilvl="5" w:tentative="1">
+      <w:start w:val="1"/>
+      <w:numFmt w:val="decimal"/>
+      <w:lvlText w:val="%6."/>
+      <w:lvlJc w:val="left"/>
+      <w:pPr>
+        <w:tabs>
+          <w:tab w:val="num" w:pos="4320"/>
+        </w:tabs>
+        <w:ind w:left="4320" w:hanging="360"/>
+      </w:pPr>
+    </w:lvl>
+    <w:lvl w:ilvl="6" w:tentative="1">
+      <w:start w:val="1"/>
+      <w:numFmt w:val="decimal"/>
+      <w:lvlText w:val="%7."/>
+      <w:lvlJc w:val="left"/>
+      <w:pPr>
+        <w:tabs>
+          <w:tab w:val="num" w:pos="5040"/>
+        </w:tabs>
+        <w:ind w:left="5040" w:hanging="360"/>
+      </w:pPr>
+    </w:lvl>
+    <w:lvl w:ilvl="7" w:tentative="1">
+      <w:start w:val="1"/>
+      <w:numFmt w:val="decimal"/>
+      <w:lvlText w:val="%8."/>
+      <w:lvlJc w:val="left"/>
+      <w:pPr>
+        <w:tabs>
+          <w:tab w:val="num" w:pos="5760"/>
+        </w:tabs>
+        <w:ind w:left="5760" w:hanging="360"/>
+      </w:pPr>
+    </w:lvl>
+    <w:lvl w:ilvl="8" w:tentative="1">
+      <w:start w:val="1"/>
+      <w:numFmt w:val="decimal"/>
+      <w:lvlText w:val="%9."/>
+      <w:lvlJc w:val="left"/>
+      <w:pPr>
+        <w:tabs>
+          <w:tab w:val="num" w:pos="6480"/>
+        </w:tabs>
+        <w:ind w:left="6480" w:hanging="360"/>
+      </w:pPr>
+    </w:lvl>
+  </w:abstractNum>
+  <w:abstractNum w:abstractNumId="10" w15:restartNumberingAfterBreak="0">
+    <w:nsid w:val="5AE542D7"/>
+    <w:multiLevelType w:val="multilevel"/>
+    <w:tmpl w:val="CF429F4A"/>
+    <w:lvl w:ilvl="0">
+      <w:start w:val="1"/>
+      <w:numFmt w:val="decimal"/>
+      <w:lvlText w:val="%1."/>
+      <w:lvlJc w:val="left"/>
+      <w:pPr>
+        <w:tabs>
+          <w:tab w:val="num" w:pos="720"/>
+        </w:tabs>
+        <w:ind w:left="720" w:hanging="360"/>
+      </w:pPr>
+    </w:lvl>
+    <w:lvl w:ilvl="1">
+      <w:start w:val="1"/>
+      <w:numFmt w:val="bullet"/>
+      <w:lvlText w:val="o"/>
+      <w:lvlJc w:val="left"/>
+      <w:pPr>
+        <w:tabs>
+          <w:tab w:val="num" w:pos="1440"/>
+        </w:tabs>
+        <w:ind w:left="1440" w:hanging="360"/>
+      </w:pPr>
+      <w:rPr>
+        <w:rFonts w:ascii="Courier New" w:hAnsi="Courier New" w:hint="default"/>
+        <w:sz w:val="20"/>
+      </w:rPr>
+    </w:lvl>
+    <w:lvl w:ilvl="2" w:tentative="1">
+      <w:start w:val="1"/>
+      <w:numFmt w:val="decimal"/>
+      <w:lvlText w:val="%3."/>
+      <w:lvlJc w:val="left"/>
+      <w:pPr>
+        <w:tabs>
+          <w:tab w:val="num" w:pos="2160"/>
+        </w:tabs>
+        <w:ind w:left="2160" w:hanging="360"/>
+      </w:pPr>
+    </w:lvl>
+    <w:lvl w:ilvl="3" w:tentative="1">
+      <w:start w:val="1"/>
+      <w:numFmt w:val="decimal"/>
+      <w:lvlText w:val="%4."/>
+      <w:lvlJc w:val="left"/>
+      <w:pPr>
+        <w:tabs>
+          <w:tab w:val="num" w:pos="2880"/>
+        </w:tabs>
+        <w:ind w:left="2880" w:hanging="360"/>
+      </w:pPr>
+    </w:lvl>
+    <w:lvl w:ilvl="4" w:tentative="1">
+      <w:start w:val="1"/>
+      <w:numFmt w:val="decimal"/>
+      <w:lvlText w:val="%5."/>
+      <w:lvlJc w:val="left"/>
+      <w:pPr>
+        <w:tabs>
+          <w:tab w:val="num" w:pos="3600"/>
+        </w:tabs>
+        <w:ind w:left="3600" w:hanging="360"/>
+      </w:pPr>
+    </w:lvl>
+    <w:lvl w:ilvl="5" w:tentative="1">
+      <w:start w:val="1"/>
+      <w:numFmt w:val="decimal"/>
+      <w:lvlText w:val="%6."/>
+      <w:lvlJc w:val="left"/>
+      <w:pPr>
+        <w:tabs>
+          <w:tab w:val="num" w:pos="4320"/>
+        </w:tabs>
+        <w:ind w:left="4320" w:hanging="360"/>
+      </w:pPr>
+    </w:lvl>
+    <w:lvl w:ilvl="6" w:tentative="1">
+      <w:start w:val="1"/>
+      <w:numFmt w:val="decimal"/>
+      <w:lvlText w:val="%7."/>
+      <w:lvlJc w:val="left"/>
+      <w:pPr>
+        <w:tabs>
+          <w:tab w:val="num" w:pos="5040"/>
+        </w:tabs>
+        <w:ind w:left="5040" w:hanging="360"/>
+      </w:pPr>
+    </w:lvl>
+    <w:lvl w:ilvl="7" w:tentative="1">
+      <w:start w:val="1"/>
+      <w:numFmt w:val="decimal"/>
+      <w:lvlText w:val="%8."/>
+      <w:lvlJc w:val="left"/>
+      <w:pPr>
+        <w:tabs>
+          <w:tab w:val="num" w:pos="5760"/>
+        </w:tabs>
+        <w:ind w:left="5760" w:hanging="360"/>
+      </w:pPr>
+    </w:lvl>
+    <w:lvl w:ilvl="8" w:tentative="1">
+      <w:start w:val="1"/>
+      <w:numFmt w:val="decimal"/>
+      <w:lvlText w:val="%9."/>
+      <w:lvlJc w:val="left"/>
+      <w:pPr>
+        <w:tabs>
+          <w:tab w:val="num" w:pos="6480"/>
+        </w:tabs>
+        <w:ind w:left="6480" w:hanging="360"/>
+      </w:pPr>
+    </w:lvl>
+  </w:abstractNum>
+  <w:abstractNum w:abstractNumId="11" w15:restartNumberingAfterBreak="0">
     <w:nsid w:val="622450A5"/>
     <w:multiLevelType w:val="multilevel"/>
     <w:tmpl w:val="FA8EA842"/>
@@ -2317,7 +5045,156 @@
       </w:pPr>
     </w:lvl>
   </w:abstractNum>
-  <w:abstractNum w:abstractNumId="5" w15:restartNumberingAfterBreak="0">
+  <w:abstractNum w:abstractNumId="12" w15:restartNumberingAfterBreak="0">
+    <w:nsid w:val="68D801DA"/>
+    <w:multiLevelType w:val="multilevel"/>
+    <w:tmpl w:val="4856A37E"/>
+    <w:lvl w:ilvl="0">
+      <w:start w:val="1"/>
+      <w:numFmt w:val="bullet"/>
+      <w:lvlText w:val=""/>
+      <w:lvlJc w:val="left"/>
+      <w:pPr>
+        <w:tabs>
+          <w:tab w:val="num" w:pos="720"/>
+        </w:tabs>
+        <w:ind w:left="720" w:hanging="360"/>
+      </w:pPr>
+      <w:rPr>
+        <w:rFonts w:ascii="Symbol" w:hAnsi="Symbol" w:hint="default"/>
+        <w:sz w:val="20"/>
+      </w:rPr>
+    </w:lvl>
+    <w:lvl w:ilvl="1" w:tentative="1">
+      <w:start w:val="1"/>
+      <w:numFmt w:val="bullet"/>
+      <w:lvlText w:val="o"/>
+      <w:lvlJc w:val="left"/>
+      <w:pPr>
+        <w:tabs>
+          <w:tab w:val="num" w:pos="1440"/>
+        </w:tabs>
+        <w:ind w:left="1440" w:hanging="360"/>
+      </w:pPr>
+      <w:rPr>
+        <w:rFonts w:ascii="Courier New" w:hAnsi="Courier New" w:hint="default"/>
+        <w:sz w:val="20"/>
+      </w:rPr>
+    </w:lvl>
+    <w:lvl w:ilvl="2" w:tentative="1">
+      <w:start w:val="1"/>
+      <w:numFmt w:val="bullet"/>
+      <w:lvlText w:val=""/>
+      <w:lvlJc w:val="left"/>
+      <w:pPr>
+        <w:tabs>
+          <w:tab w:val="num" w:pos="2160"/>
+        </w:tabs>
+        <w:ind w:left="2160" w:hanging="360"/>
+      </w:pPr>
+      <w:rPr>
+        <w:rFonts w:ascii="Wingdings" w:hAnsi="Wingdings" w:hint="default"/>
+        <w:sz w:val="20"/>
+      </w:rPr>
+    </w:lvl>
+    <w:lvl w:ilvl="3" w:tentative="1">
+      <w:start w:val="1"/>
+      <w:numFmt w:val="bullet"/>
+      <w:lvlText w:val=""/>
+      <w:lvlJc w:val="left"/>
+      <w:pPr>
+        <w:tabs>
+          <w:tab w:val="num" w:pos="2880"/>
+        </w:tabs>
+        <w:ind w:left="2880" w:hanging="360"/>
+      </w:pPr>
+      <w:rPr>
+        <w:rFonts w:ascii="Wingdings" w:hAnsi="Wingdings" w:hint="default"/>
+        <w:sz w:val="20"/>
+      </w:rPr>
+    </w:lvl>
+    <w:lvl w:ilvl="4" w:tentative="1">
+      <w:start w:val="1"/>
+      <w:numFmt w:val="bullet"/>
+      <w:lvlText w:val=""/>
+      <w:lvlJc w:val="left"/>
+      <w:pPr>
+        <w:tabs>
+          <w:tab w:val="num" w:pos="3600"/>
+        </w:tabs>
+        <w:ind w:left="3600" w:hanging="360"/>
+      </w:pPr>
+      <w:rPr>
+        <w:rFonts w:ascii="Wingdings" w:hAnsi="Wingdings" w:hint="default"/>
+        <w:sz w:val="20"/>
+      </w:rPr>
+    </w:lvl>
+    <w:lvl w:ilvl="5" w:tentative="1">
+      <w:start w:val="1"/>
+      <w:numFmt w:val="bullet"/>
+      <w:lvlText w:val=""/>
+      <w:lvlJc w:val="left"/>
+      <w:pPr>
+        <w:tabs>
+          <w:tab w:val="num" w:pos="4320"/>
+        </w:tabs>
+        <w:ind w:left="4320" w:hanging="360"/>
+      </w:pPr>
+      <w:rPr>
+        <w:rFonts w:ascii="Wingdings" w:hAnsi="Wingdings" w:hint="default"/>
+        <w:sz w:val="20"/>
+      </w:rPr>
+    </w:lvl>
+    <w:lvl w:ilvl="6" w:tentative="1">
+      <w:start w:val="1"/>
+      <w:numFmt w:val="bullet"/>
+      <w:lvlText w:val=""/>
+      <w:lvlJc w:val="left"/>
+      <w:pPr>
+        <w:tabs>
+          <w:tab w:val="num" w:pos="5040"/>
+        </w:tabs>
+        <w:ind w:left="5040" w:hanging="360"/>
+      </w:pPr>
+      <w:rPr>
+        <w:rFonts w:ascii="Wingdings" w:hAnsi="Wingdings" w:hint="default"/>
+        <w:sz w:val="20"/>
+      </w:rPr>
+    </w:lvl>
+    <w:lvl w:ilvl="7" w:tentative="1">
+      <w:start w:val="1"/>
+      <w:numFmt w:val="bullet"/>
+      <w:lvlText w:val=""/>
+      <w:lvlJc w:val="left"/>
+      <w:pPr>
+        <w:tabs>
+          <w:tab w:val="num" w:pos="5760"/>
+        </w:tabs>
+        <w:ind w:left="5760" w:hanging="360"/>
+      </w:pPr>
+      <w:rPr>
+        <w:rFonts w:ascii="Wingdings" w:hAnsi="Wingdings" w:hint="default"/>
+        <w:sz w:val="20"/>
+      </w:rPr>
+    </w:lvl>
+    <w:lvl w:ilvl="8" w:tentative="1">
+      <w:start w:val="1"/>
+      <w:numFmt w:val="bullet"/>
+      <w:lvlText w:val=""/>
+      <w:lvlJc w:val="left"/>
+      <w:pPr>
+        <w:tabs>
+          <w:tab w:val="num" w:pos="6480"/>
+        </w:tabs>
+        <w:ind w:left="6480" w:hanging="360"/>
+      </w:pPr>
+      <w:rPr>
+        <w:rFonts w:ascii="Wingdings" w:hAnsi="Wingdings" w:hint="default"/>
+        <w:sz w:val="20"/>
+      </w:rPr>
+    </w:lvl>
+  </w:abstractNum>
+  <w:abstractNum w:abstractNumId="13" w15:restartNumberingAfterBreak="0">
     <w:nsid w:val="6ADD5F84"/>
     <w:multiLevelType w:val="multilevel"/>
     <w:tmpl w:val="45BA49AE"/>
@@ -2430,7 +5307,7 @@
       </w:pPr>
     </w:lvl>
   </w:abstractNum>
-  <w:abstractNum w:abstractNumId="6" w15:restartNumberingAfterBreak="0">
+  <w:abstractNum w:abstractNumId="14" w15:restartNumberingAfterBreak="0">
     <w:nsid w:val="76271460"/>
     <w:multiLevelType w:val="multilevel"/>
     <w:tmpl w:val="BCAC8D7C"/>
@@ -2543,26 +5420,202 @@
       </w:pPr>
     </w:lvl>
   </w:abstractNum>
+  <w:abstractNum w:abstractNumId="15" w15:restartNumberingAfterBreak="0">
+    <w:nsid w:val="76BF3E35"/>
+    <w:multiLevelType w:val="multilevel"/>
+    <w:tmpl w:val="85FA2620"/>
+    <w:lvl w:ilvl="0">
+      <w:start w:val="1"/>
+      <w:numFmt w:val="bullet"/>
+      <w:lvlText w:val=""/>
+      <w:lvlJc w:val="left"/>
+      <w:pPr>
+        <w:tabs>
+          <w:tab w:val="num" w:pos="720"/>
+        </w:tabs>
+        <w:ind w:left="720" w:hanging="360"/>
+      </w:pPr>
+      <w:rPr>
+        <w:rFonts w:ascii="Symbol" w:hAnsi="Symbol" w:hint="default"/>
+        <w:sz w:val="20"/>
+      </w:rPr>
+    </w:lvl>
+    <w:lvl w:ilvl="1" w:tentative="1">
+      <w:start w:val="1"/>
+      <w:numFmt w:val="bullet"/>
+      <w:lvlText w:val="o"/>
+      <w:lvlJc w:val="left"/>
+      <w:pPr>
+        <w:tabs>
+          <w:tab w:val="num" w:pos="1440"/>
+        </w:tabs>
+        <w:ind w:left="1440" w:hanging="360"/>
+      </w:pPr>
+      <w:rPr>
+        <w:rFonts w:ascii="Courier New" w:hAnsi="Courier New" w:hint="default"/>
+        <w:sz w:val="20"/>
+      </w:rPr>
+    </w:lvl>
+    <w:lvl w:ilvl="2" w:tentative="1">
+      <w:start w:val="1"/>
+      <w:numFmt w:val="bullet"/>
+      <w:lvlText w:val=""/>
+      <w:lvlJc w:val="left"/>
+      <w:pPr>
+        <w:tabs>
+          <w:tab w:val="num" w:pos="2160"/>
+        </w:tabs>
+        <w:ind w:left="2160" w:hanging="360"/>
+      </w:pPr>
+      <w:rPr>
+        <w:rFonts w:ascii="Wingdings" w:hAnsi="Wingdings" w:hint="default"/>
+        <w:sz w:val="20"/>
+      </w:rPr>
+    </w:lvl>
+    <w:lvl w:ilvl="3" w:tentative="1">
+      <w:start w:val="1"/>
+      <w:numFmt w:val="bullet"/>
+      <w:lvlText w:val=""/>
+      <w:lvlJc w:val="left"/>
+      <w:pPr>
+        <w:tabs>
+          <w:tab w:val="num" w:pos="2880"/>
+        </w:tabs>
+        <w:ind w:left="2880" w:hanging="360"/>
+      </w:pPr>
+      <w:rPr>
+        <w:rFonts w:ascii="Wingdings" w:hAnsi="Wingdings" w:hint="default"/>
+        <w:sz w:val="20"/>
+      </w:rPr>
+    </w:lvl>
+    <w:lvl w:ilvl="4" w:tentative="1">
+      <w:start w:val="1"/>
+      <w:numFmt w:val="bullet"/>
+      <w:lvlText w:val=""/>
+      <w:lvlJc w:val="left"/>
+      <w:pPr>
+        <w:tabs>
+          <w:tab w:val="num" w:pos="3600"/>
+        </w:tabs>
+        <w:ind w:left="3600" w:hanging="360"/>
+      </w:pPr>
+      <w:rPr>
+        <w:rFonts w:ascii="Wingdings" w:hAnsi="Wingdings" w:hint="default"/>
+        <w:sz w:val="20"/>
+      </w:rPr>
+    </w:lvl>
+    <w:lvl w:ilvl="5" w:tentative="1">
+      <w:start w:val="1"/>
+      <w:numFmt w:val="bullet"/>
+      <w:lvlText w:val=""/>
+      <w:lvlJc w:val="left"/>
+      <w:pPr>
+        <w:tabs>
+          <w:tab w:val="num" w:pos="4320"/>
+        </w:tabs>
+        <w:ind w:left="4320" w:hanging="360"/>
+      </w:pPr>
+      <w:rPr>
+        <w:rFonts w:ascii="Wingdings" w:hAnsi="Wingdings" w:hint="default"/>
+        <w:sz w:val="20"/>
+      </w:rPr>
+    </w:lvl>
+    <w:lvl w:ilvl="6" w:tentative="1">
+      <w:start w:val="1"/>
+      <w:numFmt w:val="bullet"/>
+      <w:lvlText w:val=""/>
+      <w:lvlJc w:val="left"/>
+      <w:pPr>
+        <w:tabs>
+          <w:tab w:val="num" w:pos="5040"/>
+        </w:tabs>
+        <w:ind w:left="5040" w:hanging="360"/>
+      </w:pPr>
+      <w:rPr>
+        <w:rFonts w:ascii="Wingdings" w:hAnsi="Wingdings" w:hint="default"/>
+        <w:sz w:val="20"/>
+      </w:rPr>
+    </w:lvl>
+    <w:lvl w:ilvl="7" w:tentative="1">
+      <w:start w:val="1"/>
+      <w:numFmt w:val="bullet"/>
+      <w:lvlText w:val=""/>
+      <w:lvlJc w:val="left"/>
+      <w:pPr>
+        <w:tabs>
+          <w:tab w:val="num" w:pos="5760"/>
+        </w:tabs>
+        <w:ind w:left="5760" w:hanging="360"/>
+      </w:pPr>
+      <w:rPr>
+        <w:rFonts w:ascii="Wingdings" w:hAnsi="Wingdings" w:hint="default"/>
+        <w:sz w:val="20"/>
+      </w:rPr>
+    </w:lvl>
+    <w:lvl w:ilvl="8" w:tentative="1">
+      <w:start w:val="1"/>
+      <w:numFmt w:val="bullet"/>
+      <w:lvlText w:val=""/>
+      <w:lvlJc w:val="left"/>
+      <w:pPr>
+        <w:tabs>
+          <w:tab w:val="num" w:pos="6480"/>
+        </w:tabs>
+        <w:ind w:left="6480" w:hanging="360"/>
+      </w:pPr>
+      <w:rPr>
+        <w:rFonts w:ascii="Wingdings" w:hAnsi="Wingdings" w:hint="default"/>
+        <w:sz w:val="20"/>
+      </w:rPr>
+    </w:lvl>
+  </w:abstractNum>
   <w:num w:numId="1" w16cid:durableId="837694720">
+    <w:abstractNumId w:val="11"/>
+  </w:num>
+  <w:num w:numId="2" w16cid:durableId="613294624">
+    <w:abstractNumId w:val="14"/>
+  </w:num>
+  <w:num w:numId="3" w16cid:durableId="2075010764">
+    <w:abstractNumId w:val="2"/>
+  </w:num>
+  <w:num w:numId="4" w16cid:durableId="1357658255">
+    <w:abstractNumId w:val="6"/>
+  </w:num>
+  <w:num w:numId="5" w16cid:durableId="1904027860">
     <w:abstractNumId w:val="4"/>
   </w:num>
-  <w:num w:numId="2" w16cid:durableId="613294624">
-    <w:abstractNumId w:val="6"/>
+  <w:num w:numId="6" w16cid:durableId="948897942">
+    <w:abstractNumId w:val="5"/>
   </w:num>
-  <w:num w:numId="3" w16cid:durableId="2075010764">
-    <w:abstractNumId w:val="0"/>
+  <w:num w:numId="7" w16cid:durableId="270669060">
+    <w:abstractNumId w:val="13"/>
   </w:num>
-  <w:num w:numId="4" w16cid:durableId="1357658255">
+  <w:num w:numId="8" w16cid:durableId="660621233">
+    <w:abstractNumId w:val="10"/>
+  </w:num>
+  <w:num w:numId="9" w16cid:durableId="1307128580">
+    <w:abstractNumId w:val="9"/>
+  </w:num>
+  <w:num w:numId="10" w16cid:durableId="505556483">
+    <w:abstractNumId w:val="8"/>
+  </w:num>
+  <w:num w:numId="11" w16cid:durableId="160589676">
+    <w:abstractNumId w:val="15"/>
+  </w:num>
+  <w:num w:numId="12" w16cid:durableId="1511069540">
+    <w:abstractNumId w:val="12"/>
+  </w:num>
+  <w:num w:numId="13" w16cid:durableId="800608639">
     <w:abstractNumId w:val="3"/>
   </w:num>
-  <w:num w:numId="5" w16cid:durableId="1904027860">
+  <w:num w:numId="14" w16cid:durableId="606621237">
+    <w:abstractNumId w:val="7"/>
+  </w:num>
+  <w:num w:numId="15" w16cid:durableId="1423717959">
     <w:abstractNumId w:val="1"/>
   </w:num>
-  <w:num w:numId="6" w16cid:durableId="948897942">
-    <w:abstractNumId w:val="2"/>
-  </w:num>
-  <w:num w:numId="7" w16cid:durableId="270669060">
-    <w:abstractNumId w:val="5"/>
+  <w:num w:numId="16" w16cid:durableId="803426994">
+    <w:abstractNumId w:val="0"/>
   </w:num>
 </w:numbering>
 </file>

</xml_diff>